<commit_message>
Aggiornamento documentazione e diario
Nella documentazione e stata aggiunta la scelta dell ambiente di svliuppo
</commit_message>
<xml_diff>
--- a/4_Diari/Diario.docx
+++ b/4_Diari/Diario.docx
@@ -392,24 +392,398 @@
         <w:br w:type="page"/>
       </w:r>
     </w:p>
+    <w:tbl>
+      <w:tblPr>
+        <w:tblStyle w:val="Grigliatabella"/>
+        <w:tblW w:w="9634" w:type="dxa"/>
+        <w:tblLook w:val="04A0" w:firstRow="1" w:lastRow="0" w:firstColumn="1" w:lastColumn="0" w:noHBand="0" w:noVBand="1"/>
+      </w:tblPr>
+      <w:tblGrid>
+        <w:gridCol w:w="4803"/>
+        <w:gridCol w:w="4831"/>
+      </w:tblGrid>
+      <w:tr>
+        <w:trPr>
+          <w:trHeight w:hRule="exact" w:val="397"/>
+        </w:trPr>
+        <w:tc>
+          <w:tcPr>
+            <w:tcW w:w="4803" w:type="dxa"/>
+            <w:vAlign w:val="center"/>
+          </w:tcPr>
+          <w:p>
+            <w:pPr>
+              <w:rPr>
+                <w:rFonts w:ascii="Arial" w:hAnsi="Arial" w:cs="Arial"/>
+              </w:rPr>
+            </w:pPr>
+            <w:r>
+              <w:rPr>
+                <w:rFonts w:ascii="Arial" w:hAnsi="Arial" w:cs="Arial"/>
+              </w:rPr>
+              <w:lastRenderedPageBreak/>
+              <w:t>Luogo</w:t>
+            </w:r>
+          </w:p>
+        </w:tc>
+        <w:tc>
+          <w:tcPr>
+            <w:tcW w:w="4831" w:type="dxa"/>
+            <w:vAlign w:val="center"/>
+          </w:tcPr>
+          <w:p>
+            <w:pPr>
+              <w:pStyle w:val="Nessunaspaziatura"/>
+              <w:spacing w:line="360" w:lineRule="auto"/>
+              <w:rPr>
+                <w:rFonts w:ascii="Arial" w:hAnsi="Arial" w:cs="Arial"/>
+              </w:rPr>
+            </w:pPr>
+            <w:r>
+              <w:rPr>
+                <w:rFonts w:ascii="Arial" w:hAnsi="Arial" w:cs="Arial"/>
+              </w:rPr>
+              <w:t>Canobbio</w:t>
+            </w:r>
+          </w:p>
+        </w:tc>
+      </w:tr>
+      <w:tr>
+        <w:trPr>
+          <w:trHeight w:hRule="exact" w:val="397"/>
+        </w:trPr>
+        <w:tc>
+          <w:tcPr>
+            <w:tcW w:w="4803" w:type="dxa"/>
+            <w:vAlign w:val="center"/>
+          </w:tcPr>
+          <w:p>
+            <w:pPr>
+              <w:rPr>
+                <w:rFonts w:ascii="Arial" w:hAnsi="Arial" w:cs="Arial"/>
+              </w:rPr>
+            </w:pPr>
+            <w:r>
+              <w:rPr>
+                <w:rFonts w:ascii="Arial" w:hAnsi="Arial" w:cs="Arial"/>
+              </w:rPr>
+              <w:t>Data</w:t>
+            </w:r>
+          </w:p>
+        </w:tc>
+        <w:tc>
+          <w:tcPr>
+            <w:tcW w:w="4831" w:type="dxa"/>
+            <w:vAlign w:val="center"/>
+          </w:tcPr>
+          <w:p>
+            <w:pPr>
+              <w:rPr>
+                <w:rFonts w:ascii="Arial" w:hAnsi="Arial" w:cs="Arial"/>
+              </w:rPr>
+            </w:pPr>
+            <w:r>
+              <w:rPr>
+                <w:rFonts w:ascii="Arial" w:hAnsi="Arial" w:cs="Arial"/>
+              </w:rPr>
+              <w:t>30.01.2026</w:t>
+            </w:r>
+          </w:p>
+        </w:tc>
+      </w:tr>
+    </w:tbl>
     <w:p>
       <w:pPr>
-        <w:pStyle w:val="Titolo"/>
-        <w:pBdr>
-          <w:bottom w:val="single" w:sz="4" w:space="4" w:color="auto"/>
-        </w:pBdr>
         <w:rPr>
           <w:rFonts w:ascii="Arial" w:hAnsi="Arial" w:cs="Arial"/>
-          <w:color w:val="auto"/>
+        </w:rPr>
+      </w:pPr>
+    </w:p>
+    <w:tbl>
+      <w:tblPr>
+        <w:tblStyle w:val="Grigliatabella"/>
+        <w:tblW w:w="0" w:type="auto"/>
+        <w:tblLook w:val="04A0" w:firstRow="1" w:lastRow="0" w:firstColumn="1" w:lastColumn="0" w:noHBand="0" w:noVBand="1"/>
+      </w:tblPr>
+      <w:tblGrid>
+        <w:gridCol w:w="9628"/>
+      </w:tblGrid>
+      <w:tr>
+        <w:tc>
+          <w:tcPr>
+            <w:tcW w:w="9854" w:type="dxa"/>
+            <w:shd w:val="clear" w:color="auto" w:fill="D9D9D9" w:themeFill="background1" w:themeFillShade="D9"/>
+          </w:tcPr>
+          <w:p>
+            <w:pPr>
+              <w:rPr>
+                <w:rFonts w:ascii="Arial" w:hAnsi="Arial" w:cs="Arial"/>
+              </w:rPr>
+            </w:pPr>
+            <w:r>
+              <w:rPr>
+                <w:rFonts w:ascii="Arial" w:hAnsi="Arial" w:cs="Arial"/>
+              </w:rPr>
+              <w:t>Lavori svolti</w:t>
+            </w:r>
+          </w:p>
+        </w:tc>
+      </w:tr>
+      <w:tr>
+        <w:tc>
+          <w:tcPr>
+            <w:tcW w:w="9854" w:type="dxa"/>
+          </w:tcPr>
+          <w:p>
+            <w:pPr>
+              <w:rPr>
+                <w:rFonts w:ascii="Arial" w:hAnsi="Arial" w:cs="Arial"/>
+              </w:rPr>
+            </w:pPr>
+            <w:r>
+              <w:rPr>
+                <w:rFonts w:ascii="Arial" w:hAnsi="Arial" w:cs="Arial"/>
+              </w:rPr>
+              <w:t>Continuo della documentazione e ricerche ulteriori di comparazione sui diversi motori di gioco.</w:t>
+            </w:r>
+          </w:p>
+          <w:p>
+            <w:pPr>
+              <w:rPr>
+                <w:rFonts w:ascii="Arial" w:hAnsi="Arial" w:cs="Arial"/>
+              </w:rPr>
+            </w:pPr>
+            <w:r>
+              <w:rPr>
+                <w:rFonts w:ascii="Arial" w:hAnsi="Arial" w:cs="Arial"/>
+              </w:rPr>
+              <w:t>Use case iniziato.</w:t>
+            </w:r>
+          </w:p>
+        </w:tc>
+      </w:tr>
+    </w:tbl>
+    <w:p>
+      <w:pPr>
+        <w:rPr>
+          <w:rFonts w:ascii="Arial" w:hAnsi="Arial" w:cs="Arial"/>
+        </w:rPr>
+      </w:pPr>
+    </w:p>
+    <w:tbl>
+      <w:tblPr>
+        <w:tblStyle w:val="Grigliatabella"/>
+        <w:tblW w:w="0" w:type="auto"/>
+        <w:tblLook w:val="04A0" w:firstRow="1" w:lastRow="0" w:firstColumn="1" w:lastColumn="0" w:noHBand="0" w:noVBand="1"/>
+      </w:tblPr>
+      <w:tblGrid>
+        <w:gridCol w:w="9628"/>
+      </w:tblGrid>
+      <w:tr>
+        <w:tc>
+          <w:tcPr>
+            <w:tcW w:w="9854" w:type="dxa"/>
+            <w:shd w:val="clear" w:color="auto" w:fill="D9D9D9" w:themeFill="background1" w:themeFillShade="D9"/>
+          </w:tcPr>
+          <w:p>
+            <w:pPr>
+              <w:rPr>
+                <w:rFonts w:ascii="Arial" w:hAnsi="Arial" w:cs="Arial"/>
+              </w:rPr>
+            </w:pPr>
+            <w:r>
+              <w:rPr>
+                <w:rFonts w:ascii="Arial" w:hAnsi="Arial" w:cs="Arial"/>
+              </w:rPr>
+              <w:t>Problemi riscontrati e soluzioni adottate</w:t>
+            </w:r>
+          </w:p>
+        </w:tc>
+      </w:tr>
+      <w:tr>
+        <w:tc>
+          <w:tcPr>
+            <w:tcW w:w="9854" w:type="dxa"/>
+          </w:tcPr>
+          <w:p>
+            <w:pPr>
+              <w:rPr>
+                <w:rFonts w:ascii="Arial" w:hAnsi="Arial" w:cs="Arial"/>
+              </w:rPr>
+            </w:pPr>
+            <w:r>
+              <w:rPr>
+                <w:rFonts w:ascii="Arial" w:hAnsi="Arial" w:cs="Arial"/>
+              </w:rPr>
+              <w:t>nessuno</w:t>
+            </w:r>
+          </w:p>
+        </w:tc>
+      </w:tr>
+    </w:tbl>
+    <w:p>
+      <w:pPr>
+        <w:rPr>
+          <w:rFonts w:ascii="Arial" w:hAnsi="Arial" w:cs="Arial"/>
+        </w:rPr>
+      </w:pPr>
+    </w:p>
+    <w:tbl>
+      <w:tblPr>
+        <w:tblStyle w:val="Grigliatabella"/>
+        <w:tblW w:w="0" w:type="auto"/>
+        <w:tblLook w:val="04A0" w:firstRow="1" w:lastRow="0" w:firstColumn="1" w:lastColumn="0" w:noHBand="0" w:noVBand="1"/>
+      </w:tblPr>
+      <w:tblGrid>
+        <w:gridCol w:w="9628"/>
+      </w:tblGrid>
+      <w:tr>
+        <w:tc>
+          <w:tcPr>
+            <w:tcW w:w="9854" w:type="dxa"/>
+            <w:shd w:val="clear" w:color="auto" w:fill="D9D9D9" w:themeFill="background1" w:themeFillShade="D9"/>
+          </w:tcPr>
+          <w:p>
+            <w:pPr>
+              <w:rPr>
+                <w:rFonts w:ascii="Arial" w:hAnsi="Arial" w:cs="Arial"/>
+              </w:rPr>
+            </w:pPr>
+            <w:r>
+              <w:rPr>
+                <w:rFonts w:ascii="Arial" w:hAnsi="Arial" w:cs="Arial"/>
+              </w:rPr>
+              <w:t>Punto della situazione rispetto alla pianificazione</w:t>
+            </w:r>
+          </w:p>
+        </w:tc>
+      </w:tr>
+      <w:tr>
+        <w:tc>
+          <w:tcPr>
+            <w:tcW w:w="9854" w:type="dxa"/>
+          </w:tcPr>
+          <w:p>
+            <w:pPr>
+              <w:rPr>
+                <w:rFonts w:ascii="Arial" w:hAnsi="Arial" w:cs="Arial"/>
+              </w:rPr>
+            </w:pPr>
+            <w:r>
+              <w:rPr>
+                <w:rFonts w:ascii="Arial" w:hAnsi="Arial" w:cs="Arial"/>
+              </w:rPr>
+              <w:t>Pianificazione non ancora effettuata</w:t>
+            </w:r>
+          </w:p>
+        </w:tc>
+      </w:tr>
+    </w:tbl>
+    <w:p>
+      <w:pPr>
+        <w:rPr>
+          <w:rFonts w:ascii="Arial" w:hAnsi="Arial" w:cs="Arial"/>
+        </w:rPr>
+      </w:pPr>
+    </w:p>
+    <w:tbl>
+      <w:tblPr>
+        <w:tblStyle w:val="Grigliatabella"/>
+        <w:tblW w:w="0" w:type="auto"/>
+        <w:tblLook w:val="04A0" w:firstRow="1" w:lastRow="0" w:firstColumn="1" w:lastColumn="0" w:noHBand="0" w:noVBand="1"/>
+      </w:tblPr>
+      <w:tblGrid>
+        <w:gridCol w:w="9628"/>
+      </w:tblGrid>
+      <w:tr>
+        <w:tc>
+          <w:tcPr>
+            <w:tcW w:w="9854" w:type="dxa"/>
+            <w:shd w:val="clear" w:color="auto" w:fill="D9D9D9" w:themeFill="background1" w:themeFillShade="D9"/>
+          </w:tcPr>
+          <w:p>
+            <w:pPr>
+              <w:rPr>
+                <w:rFonts w:ascii="Arial" w:hAnsi="Arial" w:cs="Arial"/>
+              </w:rPr>
+            </w:pPr>
+            <w:r>
+              <w:rPr>
+                <w:rFonts w:ascii="Arial" w:hAnsi="Arial" w:cs="Arial"/>
+              </w:rPr>
+              <w:t>Programma di massima per la prossima giornata di lavoro</w:t>
+            </w:r>
+          </w:p>
+        </w:tc>
+      </w:tr>
+      <w:tr>
+        <w:tc>
+          <w:tcPr>
+            <w:tcW w:w="9854" w:type="dxa"/>
+          </w:tcPr>
+          <w:p>
+            <w:pPr>
+              <w:rPr>
+                <w:rFonts w:ascii="Arial" w:hAnsi="Arial" w:cs="Arial"/>
+                <w:u w:val="single"/>
+              </w:rPr>
+            </w:pPr>
+            <w:r>
+              <w:rPr>
+                <w:rFonts w:ascii="Arial" w:hAnsi="Arial" w:cs="Arial"/>
+              </w:rPr>
+              <w:t xml:space="preserve">Finire </w:t>
+            </w:r>
+            <w:proofErr w:type="gramStart"/>
+            <w:r>
+              <w:rPr>
+                <w:rFonts w:ascii="Arial" w:hAnsi="Arial" w:cs="Arial"/>
+              </w:rPr>
+              <w:t>lo use</w:t>
+            </w:r>
+            <w:proofErr w:type="gramEnd"/>
+            <w:r>
+              <w:rPr>
+                <w:rFonts w:ascii="Arial" w:hAnsi="Arial" w:cs="Arial"/>
+              </w:rPr>
+              <w:t xml:space="preserve"> case e fare un activity </w:t>
+            </w:r>
+            <w:proofErr w:type="spellStart"/>
+            <w:r>
+              <w:rPr>
+                <w:rFonts w:ascii="Arial" w:hAnsi="Arial" w:cs="Arial"/>
+              </w:rPr>
+              <w:t>diagram</w:t>
+            </w:r>
+            <w:proofErr w:type="spellEnd"/>
+            <w:r>
+              <w:rPr>
+                <w:rFonts w:ascii="Arial" w:hAnsi="Arial" w:cs="Arial"/>
+              </w:rPr>
+              <w:t>. Inizio pianificazione.</w:t>
+            </w:r>
+          </w:p>
+        </w:tc>
+      </w:tr>
+    </w:tbl>
+    <w:p>
+      <w:pPr>
+        <w:rPr>
+          <w:rFonts w:ascii="Arial" w:hAnsi="Arial" w:cs="Arial"/>
+        </w:rPr>
+      </w:pPr>
+    </w:p>
+    <w:p>
+      <w:pPr>
+        <w:rPr>
+          <w:rFonts w:ascii="Arial" w:hAnsi="Arial" w:cs="Arial"/>
         </w:rPr>
       </w:pPr>
       <w:r>
         <w:rPr>
           <w:rFonts w:ascii="Arial" w:hAnsi="Arial" w:cs="Arial"/>
-          <w:color w:val="auto"/>
         </w:rPr>
-        <w:lastRenderedPageBreak/>
-        <w:t>Diario di lavoro</w:t>
+        <w:br w:type="page"/>
       </w:r>
     </w:p>
     <w:tbl>
@@ -441,6 +815,7 @@
               <w:rPr>
                 <w:rFonts w:ascii="Arial" w:hAnsi="Arial" w:cs="Arial"/>
               </w:rPr>
+              <w:lastRenderedPageBreak/>
               <w:t>Luogo</w:t>
             </w:r>
           </w:p>
@@ -505,13 +880,25 @@
               <w:rPr>
                 <w:rFonts w:ascii="Arial" w:hAnsi="Arial" w:cs="Arial"/>
               </w:rPr>
-              <w:t>30</w:t>
+              <w:t>06</w:t>
             </w:r>
             <w:r>
               <w:rPr>
                 <w:rFonts w:ascii="Arial" w:hAnsi="Arial" w:cs="Arial"/>
               </w:rPr>
-              <w:t>.01.2026</w:t>
+              <w:t>.0</w:t>
+            </w:r>
+            <w:r>
+              <w:rPr>
+                <w:rFonts w:ascii="Arial" w:hAnsi="Arial" w:cs="Arial"/>
+              </w:rPr>
+              <w:t>2</w:t>
+            </w:r>
+            <w:r>
+              <w:rPr>
+                <w:rFonts w:ascii="Arial" w:hAnsi="Arial" w:cs="Arial"/>
+              </w:rPr>
+              <w:t>.2026</w:t>
             </w:r>
           </w:p>
         </w:tc>
@@ -569,7 +956,21 @@
               <w:rPr>
                 <w:rFonts w:ascii="Arial" w:hAnsi="Arial" w:cs="Arial"/>
               </w:rPr>
-              <w:t>Continuo della documentazione e ricerche ulteriori di comparazione sui diversi motori di gioco.</w:t>
+              <w:t xml:space="preserve">Oggi abbiamo creato </w:t>
+            </w:r>
+            <w:proofErr w:type="gramStart"/>
+            <w:r>
+              <w:rPr>
+                <w:rFonts w:ascii="Arial" w:hAnsi="Arial" w:cs="Arial"/>
+              </w:rPr>
+              <w:t>gli use</w:t>
+            </w:r>
+            <w:proofErr w:type="gramEnd"/>
+            <w:r>
+              <w:rPr>
+                <w:rFonts w:ascii="Arial" w:hAnsi="Arial" w:cs="Arial"/>
+              </w:rPr>
+              <w:t xml:space="preserve"> case per la logica del nostro gioco; inoltre, abbiamo continuato la documentazione aggiungendo le nostre ricerche sul motore grafico.</w:t>
             </w:r>
           </w:p>
           <w:p>
@@ -582,7 +983,21 @@
               <w:rPr>
                 <w:rFonts w:ascii="Arial" w:hAnsi="Arial" w:cs="Arial"/>
               </w:rPr>
-              <w:t>Use case iniziato.</w:t>
+              <w:t xml:space="preserve">Abbiamo continuato a creare la grafica e la storia del nostro gioco e iniziato a fare i </w:t>
+            </w:r>
+            <w:proofErr w:type="spellStart"/>
+            <w:r>
+              <w:rPr>
+                <w:rFonts w:ascii="Arial" w:hAnsi="Arial" w:cs="Arial"/>
+              </w:rPr>
+              <w:t>mockup</w:t>
+            </w:r>
+            <w:proofErr w:type="spellEnd"/>
+            <w:r>
+              <w:rPr>
+                <w:rFonts w:ascii="Arial" w:hAnsi="Arial" w:cs="Arial"/>
+              </w:rPr>
+              <w:t>.</w:t>
             </w:r>
           </w:p>
         </w:tc>
@@ -757,35 +1172,7 @@
               <w:rPr>
                 <w:rFonts w:ascii="Arial" w:hAnsi="Arial" w:cs="Arial"/>
               </w:rPr>
-              <w:t xml:space="preserve">Finire </w:t>
-            </w:r>
-            <w:proofErr w:type="gramStart"/>
-            <w:r>
-              <w:rPr>
-                <w:rFonts w:ascii="Arial" w:hAnsi="Arial" w:cs="Arial"/>
-              </w:rPr>
-              <w:t>lo use</w:t>
-            </w:r>
-            <w:proofErr w:type="gramEnd"/>
-            <w:r>
-              <w:rPr>
-                <w:rFonts w:ascii="Arial" w:hAnsi="Arial" w:cs="Arial"/>
-              </w:rPr>
-              <w:t xml:space="preserve"> case e fare un activity </w:t>
-            </w:r>
-            <w:proofErr w:type="spellStart"/>
-            <w:r>
-              <w:rPr>
-                <w:rFonts w:ascii="Arial" w:hAnsi="Arial" w:cs="Arial"/>
-              </w:rPr>
-              <w:t>diagram</w:t>
-            </w:r>
-            <w:proofErr w:type="spellEnd"/>
-            <w:r>
-              <w:rPr>
-                <w:rFonts w:ascii="Arial" w:hAnsi="Arial" w:cs="Arial"/>
-              </w:rPr>
-              <w:t>. Inizio pianificazione.</w:t>
+              <w:t>Continuo della documentazione, ulteriori ricerche e inizio use case.</w:t>
             </w:r>
           </w:p>
         </w:tc>
@@ -1054,30 +1441,13 @@
       <w:rPr>
         <w:rFonts w:ascii="Arial" w:hAnsi="Arial" w:cs="Arial"/>
       </w:rPr>
-      <w:t xml:space="preserve"> Bianchi e </w:t>
+      <w:t xml:space="preserve"> Bianchi e Nicola Cappelli</w:t>
     </w:r>
     <w:r>
       <w:rPr>
         <w:rFonts w:ascii="Arial" w:hAnsi="Arial" w:cs="Arial"/>
       </w:rPr>
-      <w:t>Nicola</w:t>
-    </w:r>
-    <w:r>
-      <w:rPr>
-        <w:rFonts w:ascii="Arial" w:hAnsi="Arial" w:cs="Arial"/>
-      </w:rPr>
-      <w:t xml:space="preserve"> Cappelli</w:t>
-    </w:r>
-    <w:r>
-      <w:rPr>
-        <w:rFonts w:ascii="Arial" w:hAnsi="Arial" w:cs="Arial"/>
-      </w:rPr>
       <w:tab/>
-    </w:r>
-    <w:r>
-      <w:rPr>
-        <w:rFonts w:ascii="Arial" w:hAnsi="Arial" w:cs="Arial"/>
-      </w:rPr>
       <w:t>I3AC 2025-26</w:t>
     </w:r>
   </w:p>
@@ -3780,7 +4150,6 @@
   <w:style w:type="character" w:default="1" w:styleId="Carpredefinitoparagrafo">
     <w:name w:val="Default Paragraph Font"/>
     <w:uiPriority w:val="1"/>
-    <w:semiHidden/>
     <w:unhideWhenUsed/>
   </w:style>
   <w:style w:type="table" w:default="1" w:styleId="Tabellanormale">
@@ -4418,6 +4787,7 @@
     <w:rsid w:val="007E2877"/>
     <w:rsid w:val="008073A0"/>
     <w:rsid w:val="00842400"/>
+    <w:rsid w:val="00854252"/>
     <w:rsid w:val="00866671"/>
     <w:rsid w:val="00886235"/>
     <w:rsid w:val="008A6626"/>
@@ -4451,6 +4821,7 @@
     <w:rsid w:val="00C22A10"/>
     <w:rsid w:val="00C57AC2"/>
     <w:rsid w:val="00C727A9"/>
+    <w:rsid w:val="00C9569D"/>
     <w:rsid w:val="00C97640"/>
     <w:rsid w:val="00CB349C"/>
     <w:rsid w:val="00CC5E51"/>

</xml_diff>

<commit_message>
Aggiornamento diario, riordinamento files nella directory Allegati e continuo sviluppo della grafica del gioco
</commit_message>
<xml_diff>
--- a/4_Diari/Diario.docx
+++ b/4_Diari/Diario.docx
@@ -392,24 +392,370 @@
         <w:br w:type="page"/>
       </w:r>
     </w:p>
+    <w:tbl>
+      <w:tblPr>
+        <w:tblStyle w:val="Grigliatabella"/>
+        <w:tblW w:w="9634" w:type="dxa"/>
+        <w:tblLook w:val="04A0" w:firstRow="1" w:lastRow="0" w:firstColumn="1" w:lastColumn="0" w:noHBand="0" w:noVBand="1"/>
+      </w:tblPr>
+      <w:tblGrid>
+        <w:gridCol w:w="4803"/>
+        <w:gridCol w:w="4831"/>
+      </w:tblGrid>
+      <w:tr>
+        <w:trPr>
+          <w:trHeight w:hRule="exact" w:val="397"/>
+        </w:trPr>
+        <w:tc>
+          <w:tcPr>
+            <w:tcW w:w="4803" w:type="dxa"/>
+            <w:vAlign w:val="center"/>
+          </w:tcPr>
+          <w:p>
+            <w:pPr>
+              <w:rPr>
+                <w:rFonts w:ascii="Arial" w:hAnsi="Arial" w:cs="Arial"/>
+              </w:rPr>
+            </w:pPr>
+            <w:r>
+              <w:rPr>
+                <w:rFonts w:ascii="Arial" w:hAnsi="Arial" w:cs="Arial"/>
+              </w:rPr>
+              <w:lastRenderedPageBreak/>
+              <w:t>Luogo</w:t>
+            </w:r>
+          </w:p>
+        </w:tc>
+        <w:tc>
+          <w:tcPr>
+            <w:tcW w:w="4831" w:type="dxa"/>
+            <w:vAlign w:val="center"/>
+          </w:tcPr>
+          <w:p>
+            <w:pPr>
+              <w:pStyle w:val="Nessunaspaziatura"/>
+              <w:spacing w:line="360" w:lineRule="auto"/>
+              <w:rPr>
+                <w:rFonts w:ascii="Arial" w:hAnsi="Arial" w:cs="Arial"/>
+              </w:rPr>
+            </w:pPr>
+            <w:r>
+              <w:rPr>
+                <w:rFonts w:ascii="Arial" w:hAnsi="Arial" w:cs="Arial"/>
+              </w:rPr>
+              <w:t>Canobbio</w:t>
+            </w:r>
+          </w:p>
+        </w:tc>
+      </w:tr>
+      <w:tr>
+        <w:trPr>
+          <w:trHeight w:hRule="exact" w:val="397"/>
+        </w:trPr>
+        <w:tc>
+          <w:tcPr>
+            <w:tcW w:w="4803" w:type="dxa"/>
+            <w:vAlign w:val="center"/>
+          </w:tcPr>
+          <w:p>
+            <w:pPr>
+              <w:rPr>
+                <w:rFonts w:ascii="Arial" w:hAnsi="Arial" w:cs="Arial"/>
+              </w:rPr>
+            </w:pPr>
+            <w:r>
+              <w:rPr>
+                <w:rFonts w:ascii="Arial" w:hAnsi="Arial" w:cs="Arial"/>
+              </w:rPr>
+              <w:t>Data</w:t>
+            </w:r>
+          </w:p>
+        </w:tc>
+        <w:tc>
+          <w:tcPr>
+            <w:tcW w:w="4831" w:type="dxa"/>
+            <w:vAlign w:val="center"/>
+          </w:tcPr>
+          <w:p>
+            <w:pPr>
+              <w:rPr>
+                <w:rFonts w:ascii="Arial" w:hAnsi="Arial" w:cs="Arial"/>
+              </w:rPr>
+            </w:pPr>
+            <w:r>
+              <w:rPr>
+                <w:rFonts w:ascii="Arial" w:hAnsi="Arial" w:cs="Arial"/>
+              </w:rPr>
+              <w:t>30.01.2026</w:t>
+            </w:r>
+          </w:p>
+        </w:tc>
+      </w:tr>
+    </w:tbl>
     <w:p>
       <w:pPr>
-        <w:pStyle w:val="Titolo"/>
-        <w:pBdr>
-          <w:bottom w:val="single" w:sz="4" w:space="4" w:color="auto"/>
-        </w:pBdr>
         <w:rPr>
           <w:rFonts w:ascii="Arial" w:hAnsi="Arial" w:cs="Arial"/>
-          <w:color w:val="auto"/>
+        </w:rPr>
+      </w:pPr>
+    </w:p>
+    <w:tbl>
+      <w:tblPr>
+        <w:tblStyle w:val="Grigliatabella"/>
+        <w:tblW w:w="0" w:type="auto"/>
+        <w:tblLook w:val="04A0" w:firstRow="1" w:lastRow="0" w:firstColumn="1" w:lastColumn="0" w:noHBand="0" w:noVBand="1"/>
+      </w:tblPr>
+      <w:tblGrid>
+        <w:gridCol w:w="9628"/>
+      </w:tblGrid>
+      <w:tr>
+        <w:tc>
+          <w:tcPr>
+            <w:tcW w:w="9854" w:type="dxa"/>
+            <w:shd w:val="clear" w:color="auto" w:fill="D9D9D9" w:themeFill="background1" w:themeFillShade="D9"/>
+          </w:tcPr>
+          <w:p>
+            <w:pPr>
+              <w:rPr>
+                <w:rFonts w:ascii="Arial" w:hAnsi="Arial" w:cs="Arial"/>
+              </w:rPr>
+            </w:pPr>
+            <w:r>
+              <w:rPr>
+                <w:rFonts w:ascii="Arial" w:hAnsi="Arial" w:cs="Arial"/>
+              </w:rPr>
+              <w:t>Lavori svolti</w:t>
+            </w:r>
+          </w:p>
+        </w:tc>
+      </w:tr>
+      <w:tr>
+        <w:tc>
+          <w:tcPr>
+            <w:tcW w:w="9854" w:type="dxa"/>
+          </w:tcPr>
+          <w:p>
+            <w:pPr>
+              <w:rPr>
+                <w:rFonts w:ascii="Arial" w:hAnsi="Arial" w:cs="Arial"/>
+              </w:rPr>
+            </w:pPr>
+            <w:r>
+              <w:rPr>
+                <w:rFonts w:ascii="Arial" w:hAnsi="Arial" w:cs="Arial"/>
+              </w:rPr>
+              <w:t>Continuo della documentazione e ricerche ulteriori di comparazione sui diversi motori di gioco.</w:t>
+            </w:r>
+          </w:p>
+          <w:p>
+            <w:pPr>
+              <w:rPr>
+                <w:rFonts w:ascii="Arial" w:hAnsi="Arial" w:cs="Arial"/>
+              </w:rPr>
+            </w:pPr>
+            <w:r>
+              <w:rPr>
+                <w:rFonts w:ascii="Arial" w:hAnsi="Arial" w:cs="Arial"/>
+              </w:rPr>
+              <w:t>Use case iniziato.</w:t>
+            </w:r>
+          </w:p>
+        </w:tc>
+      </w:tr>
+    </w:tbl>
+    <w:p>
+      <w:pPr>
+        <w:rPr>
+          <w:rFonts w:ascii="Arial" w:hAnsi="Arial" w:cs="Arial"/>
+        </w:rPr>
+      </w:pPr>
+    </w:p>
+    <w:tbl>
+      <w:tblPr>
+        <w:tblStyle w:val="Grigliatabella"/>
+        <w:tblW w:w="0" w:type="auto"/>
+        <w:tblLook w:val="04A0" w:firstRow="1" w:lastRow="0" w:firstColumn="1" w:lastColumn="0" w:noHBand="0" w:noVBand="1"/>
+      </w:tblPr>
+      <w:tblGrid>
+        <w:gridCol w:w="9628"/>
+      </w:tblGrid>
+      <w:tr>
+        <w:tc>
+          <w:tcPr>
+            <w:tcW w:w="9854" w:type="dxa"/>
+            <w:shd w:val="clear" w:color="auto" w:fill="D9D9D9" w:themeFill="background1" w:themeFillShade="D9"/>
+          </w:tcPr>
+          <w:p>
+            <w:pPr>
+              <w:rPr>
+                <w:rFonts w:ascii="Arial" w:hAnsi="Arial" w:cs="Arial"/>
+              </w:rPr>
+            </w:pPr>
+            <w:r>
+              <w:rPr>
+                <w:rFonts w:ascii="Arial" w:hAnsi="Arial" w:cs="Arial"/>
+              </w:rPr>
+              <w:t>Problemi riscontrati e soluzioni adottate</w:t>
+            </w:r>
+          </w:p>
+        </w:tc>
+      </w:tr>
+      <w:tr>
+        <w:tc>
+          <w:tcPr>
+            <w:tcW w:w="9854" w:type="dxa"/>
+          </w:tcPr>
+          <w:p>
+            <w:pPr>
+              <w:rPr>
+                <w:rFonts w:ascii="Arial" w:hAnsi="Arial" w:cs="Arial"/>
+              </w:rPr>
+            </w:pPr>
+            <w:r>
+              <w:rPr>
+                <w:rFonts w:ascii="Arial" w:hAnsi="Arial" w:cs="Arial"/>
+              </w:rPr>
+              <w:t>nessuno</w:t>
+            </w:r>
+          </w:p>
+        </w:tc>
+      </w:tr>
+    </w:tbl>
+    <w:p>
+      <w:pPr>
+        <w:rPr>
+          <w:rFonts w:ascii="Arial" w:hAnsi="Arial" w:cs="Arial"/>
+        </w:rPr>
+      </w:pPr>
+    </w:p>
+    <w:tbl>
+      <w:tblPr>
+        <w:tblStyle w:val="Grigliatabella"/>
+        <w:tblW w:w="0" w:type="auto"/>
+        <w:tblLook w:val="04A0" w:firstRow="1" w:lastRow="0" w:firstColumn="1" w:lastColumn="0" w:noHBand="0" w:noVBand="1"/>
+      </w:tblPr>
+      <w:tblGrid>
+        <w:gridCol w:w="9628"/>
+      </w:tblGrid>
+      <w:tr>
+        <w:tc>
+          <w:tcPr>
+            <w:tcW w:w="9854" w:type="dxa"/>
+            <w:shd w:val="clear" w:color="auto" w:fill="D9D9D9" w:themeFill="background1" w:themeFillShade="D9"/>
+          </w:tcPr>
+          <w:p>
+            <w:pPr>
+              <w:rPr>
+                <w:rFonts w:ascii="Arial" w:hAnsi="Arial" w:cs="Arial"/>
+              </w:rPr>
+            </w:pPr>
+            <w:r>
+              <w:rPr>
+                <w:rFonts w:ascii="Arial" w:hAnsi="Arial" w:cs="Arial"/>
+              </w:rPr>
+              <w:t>Punto della situazione rispetto alla pianificazione</w:t>
+            </w:r>
+          </w:p>
+        </w:tc>
+      </w:tr>
+      <w:tr>
+        <w:tc>
+          <w:tcPr>
+            <w:tcW w:w="9854" w:type="dxa"/>
+          </w:tcPr>
+          <w:p>
+            <w:pPr>
+              <w:rPr>
+                <w:rFonts w:ascii="Arial" w:hAnsi="Arial" w:cs="Arial"/>
+              </w:rPr>
+            </w:pPr>
+            <w:r>
+              <w:rPr>
+                <w:rFonts w:ascii="Arial" w:hAnsi="Arial" w:cs="Arial"/>
+              </w:rPr>
+              <w:t>Pianificazione non ancora effettuata</w:t>
+            </w:r>
+          </w:p>
+        </w:tc>
+      </w:tr>
+    </w:tbl>
+    <w:p>
+      <w:pPr>
+        <w:rPr>
+          <w:rFonts w:ascii="Arial" w:hAnsi="Arial" w:cs="Arial"/>
+        </w:rPr>
+      </w:pPr>
+    </w:p>
+    <w:tbl>
+      <w:tblPr>
+        <w:tblStyle w:val="Grigliatabella"/>
+        <w:tblW w:w="0" w:type="auto"/>
+        <w:tblLook w:val="04A0" w:firstRow="1" w:lastRow="0" w:firstColumn="1" w:lastColumn="0" w:noHBand="0" w:noVBand="1"/>
+      </w:tblPr>
+      <w:tblGrid>
+        <w:gridCol w:w="9628"/>
+      </w:tblGrid>
+      <w:tr>
+        <w:tc>
+          <w:tcPr>
+            <w:tcW w:w="9854" w:type="dxa"/>
+            <w:shd w:val="clear" w:color="auto" w:fill="D9D9D9" w:themeFill="background1" w:themeFillShade="D9"/>
+          </w:tcPr>
+          <w:p>
+            <w:pPr>
+              <w:rPr>
+                <w:rFonts w:ascii="Arial" w:hAnsi="Arial" w:cs="Arial"/>
+              </w:rPr>
+            </w:pPr>
+            <w:r>
+              <w:rPr>
+                <w:rFonts w:ascii="Arial" w:hAnsi="Arial" w:cs="Arial"/>
+              </w:rPr>
+              <w:t>Programma di massima per la prossima giornata di lavoro</w:t>
+            </w:r>
+          </w:p>
+        </w:tc>
+      </w:tr>
+      <w:tr>
+        <w:tc>
+          <w:tcPr>
+            <w:tcW w:w="9854" w:type="dxa"/>
+          </w:tcPr>
+          <w:p>
+            <w:pPr>
+              <w:rPr>
+                <w:rFonts w:ascii="Arial" w:hAnsi="Arial" w:cs="Arial"/>
+                <w:u w:val="single"/>
+              </w:rPr>
+            </w:pPr>
+            <w:r>
+              <w:rPr>
+                <w:rFonts w:ascii="Arial" w:hAnsi="Arial" w:cs="Arial"/>
+              </w:rPr>
+              <w:t>Finire lo use case e fare un activity diagram. Inizio pianificazione.</w:t>
+            </w:r>
+          </w:p>
+        </w:tc>
+      </w:tr>
+    </w:tbl>
+    <w:p>
+      <w:pPr>
+        <w:rPr>
+          <w:rFonts w:ascii="Arial" w:hAnsi="Arial" w:cs="Arial"/>
+        </w:rPr>
+      </w:pPr>
+    </w:p>
+    <w:p>
+      <w:pPr>
+        <w:rPr>
+          <w:rFonts w:ascii="Arial" w:hAnsi="Arial" w:cs="Arial"/>
         </w:rPr>
       </w:pPr>
       <w:r>
         <w:rPr>
           <w:rFonts w:ascii="Arial" w:hAnsi="Arial" w:cs="Arial"/>
-          <w:color w:val="auto"/>
         </w:rPr>
-        <w:lastRenderedPageBreak/>
-        <w:t>Diario di lavoro</w:t>
+        <w:br w:type="page"/>
       </w:r>
     </w:p>
     <w:tbl>
@@ -441,6 +787,7 @@
               <w:rPr>
                 <w:rFonts w:ascii="Arial" w:hAnsi="Arial" w:cs="Arial"/>
               </w:rPr>
+              <w:lastRenderedPageBreak/>
               <w:t>Luogo</w:t>
             </w:r>
           </w:p>
@@ -505,13 +852,7 @@
               <w:rPr>
                 <w:rFonts w:ascii="Arial" w:hAnsi="Arial" w:cs="Arial"/>
               </w:rPr>
-              <w:t>30</w:t>
-            </w:r>
-            <w:r>
-              <w:rPr>
-                <w:rFonts w:ascii="Arial" w:hAnsi="Arial" w:cs="Arial"/>
-              </w:rPr>
-              <w:t>.01.2026</w:t>
+              <w:t>06.02.2026</w:t>
             </w:r>
           </w:p>
         </w:tc>
@@ -569,7 +910,43 @@
               <w:rPr>
                 <w:rFonts w:ascii="Arial" w:hAnsi="Arial" w:cs="Arial"/>
               </w:rPr>
-              <w:t>Continuo della documentazione e ricerche ulteriori di comparazione sui diversi motori di gioco.</w:t>
+              <w:t xml:space="preserve">Oggi abbiamo </w:t>
+            </w:r>
+            <w:r>
+              <w:rPr>
+                <w:rFonts w:ascii="Arial" w:hAnsi="Arial" w:cs="Arial"/>
+              </w:rPr>
+              <w:t>continuato</w:t>
+            </w:r>
+            <w:r>
+              <w:rPr>
+                <w:rFonts w:ascii="Arial" w:hAnsi="Arial" w:cs="Arial"/>
+              </w:rPr>
+              <w:t xml:space="preserve"> gli use case per la logica del nostro gioco</w:t>
+            </w:r>
+            <w:r>
+              <w:rPr>
+                <w:rFonts w:ascii="Arial" w:hAnsi="Arial" w:cs="Arial"/>
+              </w:rPr>
+              <w:t xml:space="preserve"> (ora in fase di verifica)</w:t>
+            </w:r>
+            <w:r>
+              <w:rPr>
+                <w:rFonts w:ascii="Arial" w:hAnsi="Arial" w:cs="Arial"/>
+              </w:rPr>
+              <w:t xml:space="preserve">; inoltre, abbiamo continuato la documentazione aggiungendo le nostre ricerche sul motore </w:t>
+            </w:r>
+            <w:r>
+              <w:rPr>
+                <w:rFonts w:ascii="Arial" w:hAnsi="Arial" w:cs="Arial"/>
+              </w:rPr>
+              <w:t>di gioco facendo comparazioni</w:t>
+            </w:r>
+            <w:r>
+              <w:rPr>
+                <w:rFonts w:ascii="Arial" w:hAnsi="Arial" w:cs="Arial"/>
+              </w:rPr>
+              <w:t>.</w:t>
             </w:r>
           </w:p>
           <w:p>
@@ -582,7 +959,31 @@
               <w:rPr>
                 <w:rFonts w:ascii="Arial" w:hAnsi="Arial" w:cs="Arial"/>
               </w:rPr>
-              <w:t>Use case iniziato.</w:t>
+              <w:t xml:space="preserve">Abbiamo </w:t>
+            </w:r>
+            <w:r>
+              <w:rPr>
+                <w:rFonts w:ascii="Arial" w:hAnsi="Arial" w:cs="Arial"/>
+              </w:rPr>
+              <w:t>creato</w:t>
+            </w:r>
+            <w:r>
+              <w:rPr>
+                <w:rFonts w:ascii="Arial" w:hAnsi="Arial" w:cs="Arial"/>
+              </w:rPr>
+              <w:t xml:space="preserve"> la grafica e la storia del nostro gioco e iniziato a fare i mockup</w:t>
+            </w:r>
+            <w:r>
+              <w:rPr>
+                <w:rFonts w:ascii="Arial" w:hAnsi="Arial" w:cs="Arial"/>
+              </w:rPr>
+              <w:t xml:space="preserve"> su interfacce e parti della mappa/personaggi</w:t>
+            </w:r>
+            <w:r>
+              <w:rPr>
+                <w:rFonts w:ascii="Arial" w:hAnsi="Arial" w:cs="Arial"/>
+              </w:rPr>
+              <w:t>.</w:t>
             </w:r>
           </w:p>
         </w:tc>
@@ -640,7 +1041,7 @@
               <w:rPr>
                 <w:rFonts w:ascii="Arial" w:hAnsi="Arial" w:cs="Arial"/>
               </w:rPr>
-              <w:t>nessuno</w:t>
+              <w:t>Documentazione persa da parte di uno dei collaboratori, risolto obbligandolo a rifarla com’era prima, il che ha fatto perdere del tempo al gruppo.</w:t>
             </w:r>
           </w:p>
         </w:tc>
@@ -757,35 +1158,43 @@
               <w:rPr>
                 <w:rFonts w:ascii="Arial" w:hAnsi="Arial" w:cs="Arial"/>
               </w:rPr>
-              <w:t xml:space="preserve">Finire </w:t>
+              <w:t>Ulteriori</w:t>
             </w:r>
-            <w:proofErr w:type="gramStart"/>
             <w:r>
               <w:rPr>
                 <w:rFonts w:ascii="Arial" w:hAnsi="Arial" w:cs="Arial"/>
               </w:rPr>
-              <w:t>lo use</w:t>
+              <w:t xml:space="preserve"> ricerche</w:t>
             </w:r>
-            <w:proofErr w:type="gramEnd"/>
             <w:r>
               <w:rPr>
                 <w:rFonts w:ascii="Arial" w:hAnsi="Arial" w:cs="Arial"/>
               </w:rPr>
-              <w:t xml:space="preserve"> case e fare un activity </w:t>
+              <w:t xml:space="preserve"> sul motore di gioco</w:t>
             </w:r>
-            <w:proofErr w:type="spellStart"/>
             <w:r>
               <w:rPr>
                 <w:rFonts w:ascii="Arial" w:hAnsi="Arial" w:cs="Arial"/>
               </w:rPr>
-              <w:t>diagram</w:t>
+              <w:t xml:space="preserve"> e </w:t>
             </w:r>
-            <w:proofErr w:type="spellEnd"/>
             <w:r>
               <w:rPr>
                 <w:rFonts w:ascii="Arial" w:hAnsi="Arial" w:cs="Arial"/>
               </w:rPr>
-              <w:t>. Inizio pianificazione.</w:t>
+              <w:t>conferma</w:t>
+            </w:r>
+            <w:r>
+              <w:rPr>
+                <w:rFonts w:ascii="Arial" w:hAnsi="Arial" w:cs="Arial"/>
+              </w:rPr>
+              <w:t xml:space="preserve"> use case.</w:t>
+            </w:r>
+            <w:r>
+              <w:rPr>
+                <w:rFonts w:ascii="Arial" w:hAnsi="Arial" w:cs="Arial"/>
+              </w:rPr>
+              <w:t xml:space="preserve"> Inizio Activity Diagram. Continuo sviluppo dei Mockup dei personaggi/mappa.</w:t>
             </w:r>
           </w:p>
         </w:tc>
@@ -864,35 +1273,7 @@
           <w:rPr>
             <w:rFonts w:ascii="Arial" w:hAnsi="Arial" w:cs="Arial"/>
           </w:rPr>
-          <w:t xml:space="preserve">System </w:t>
-        </w:r>
-        <w:proofErr w:type="spellStart"/>
-        <w:r>
-          <w:rPr>
-            <w:rFonts w:ascii="Arial" w:hAnsi="Arial" w:cs="Arial"/>
-          </w:rPr>
-          <w:t>Breach</w:t>
-        </w:r>
-        <w:proofErr w:type="spellEnd"/>
-        <w:r>
-          <w:rPr>
-            <w:rFonts w:ascii="Arial" w:hAnsi="Arial" w:cs="Arial"/>
-          </w:rPr>
-          <w:t xml:space="preserve">: </w:t>
-        </w:r>
-        <w:proofErr w:type="spellStart"/>
-        <w:r>
-          <w:rPr>
-            <w:rFonts w:ascii="Arial" w:hAnsi="Arial" w:cs="Arial"/>
-          </w:rPr>
-          <w:t>Five</w:t>
-        </w:r>
-        <w:proofErr w:type="spellEnd"/>
-        <w:r>
-          <w:rPr>
-            <w:rFonts w:ascii="Arial" w:hAnsi="Arial" w:cs="Arial"/>
-          </w:rPr>
-          <w:t xml:space="preserve"> Nights</w:t>
+          <w:t>System Breach: Five Nights</w:t>
         </w:r>
       </w:sdtContent>
     </w:sdt>
@@ -1054,30 +1435,13 @@
       <w:rPr>
         <w:rFonts w:ascii="Arial" w:hAnsi="Arial" w:cs="Arial"/>
       </w:rPr>
-      <w:t xml:space="preserve"> Bianchi e </w:t>
+      <w:t xml:space="preserve"> Bianchi e Nicola Cappelli</w:t>
     </w:r>
     <w:r>
       <w:rPr>
         <w:rFonts w:ascii="Arial" w:hAnsi="Arial" w:cs="Arial"/>
       </w:rPr>
-      <w:t>Nicola</w:t>
-    </w:r>
-    <w:r>
-      <w:rPr>
-        <w:rFonts w:ascii="Arial" w:hAnsi="Arial" w:cs="Arial"/>
-      </w:rPr>
-      <w:t xml:space="preserve"> Cappelli</w:t>
-    </w:r>
-    <w:r>
-      <w:rPr>
-        <w:rFonts w:ascii="Arial" w:hAnsi="Arial" w:cs="Arial"/>
-      </w:rPr>
       <w:tab/>
-    </w:r>
-    <w:r>
-      <w:rPr>
-        <w:rFonts w:ascii="Arial" w:hAnsi="Arial" w:cs="Arial"/>
-      </w:rPr>
       <w:t>I3AC 2025-26</w:t>
     </w:r>
   </w:p>
@@ -4396,6 +4760,7 @@
     <w:rsid w:val="00544CC3"/>
     <w:rsid w:val="00580D3A"/>
     <w:rsid w:val="00594413"/>
+    <w:rsid w:val="00595755"/>
     <w:rsid w:val="005B2EF9"/>
     <w:rsid w:val="005B64EA"/>
     <w:rsid w:val="005D27BB"/>
@@ -4418,6 +4783,7 @@
     <w:rsid w:val="007E2877"/>
     <w:rsid w:val="008073A0"/>
     <w:rsid w:val="00842400"/>
+    <w:rsid w:val="00854252"/>
     <w:rsid w:val="00866671"/>
     <w:rsid w:val="00886235"/>
     <w:rsid w:val="008A6626"/>
@@ -4445,12 +4811,14 @@
     <w:rsid w:val="00AE278E"/>
     <w:rsid w:val="00AE7D08"/>
     <w:rsid w:val="00AF0AA0"/>
+    <w:rsid w:val="00AF150E"/>
     <w:rsid w:val="00B36B9F"/>
     <w:rsid w:val="00B5079C"/>
     <w:rsid w:val="00BD119E"/>
     <w:rsid w:val="00C22A10"/>
     <w:rsid w:val="00C57AC2"/>
     <w:rsid w:val="00C727A9"/>
+    <w:rsid w:val="00C9569D"/>
     <w:rsid w:val="00C97640"/>
     <w:rsid w:val="00CB349C"/>
     <w:rsid w:val="00CC5E51"/>

</xml_diff>

<commit_message>
Poster aggiunto e modificato il diario
</commit_message>
<xml_diff>
--- a/4_Diari/Diario.docx
+++ b/4_Diari/Diario.docx
@@ -732,21 +732,7 @@
               <w:rPr>
                 <w:rFonts w:ascii="Arial" w:hAnsi="Arial" w:cs="Arial"/>
               </w:rPr>
-              <w:t xml:space="preserve">Finire lo use case e fare un activity </w:t>
-            </w:r>
-            <w:proofErr w:type="spellStart"/>
-            <w:r>
-              <w:rPr>
-                <w:rFonts w:ascii="Arial" w:hAnsi="Arial" w:cs="Arial"/>
-              </w:rPr>
-              <w:t>diagram</w:t>
-            </w:r>
-            <w:proofErr w:type="spellEnd"/>
-            <w:r>
-              <w:rPr>
-                <w:rFonts w:ascii="Arial" w:hAnsi="Arial" w:cs="Arial"/>
-              </w:rPr>
-              <w:t>. Inizio pianificazione.</w:t>
+              <w:t>Finire lo use case e fare un activity diagram. Inizio pianificazione.</w:t>
             </w:r>
           </w:p>
         </w:tc>
@@ -985,21 +971,7 @@
               <w:rPr>
                 <w:rFonts w:ascii="Arial" w:hAnsi="Arial" w:cs="Arial"/>
               </w:rPr>
-              <w:t xml:space="preserve"> a creare la grafica e la storia del nostro gioco e iniziato a fare i </w:t>
-            </w:r>
-            <w:proofErr w:type="spellStart"/>
-            <w:r>
-              <w:rPr>
-                <w:rFonts w:ascii="Arial" w:hAnsi="Arial" w:cs="Arial"/>
-              </w:rPr>
-              <w:t>mockup</w:t>
-            </w:r>
-            <w:proofErr w:type="spellEnd"/>
-            <w:r>
-              <w:rPr>
-                <w:rFonts w:ascii="Arial" w:hAnsi="Arial" w:cs="Arial"/>
-              </w:rPr>
-              <w:t>.</w:t>
+              <w:t xml:space="preserve"> a creare la grafica e la storia del nostro gioco e iniziato a fare i mockup.</w:t>
             </w:r>
           </w:p>
         </w:tc>
@@ -1198,30 +1170,8 @@
               <w:rPr>
                 <w:rFonts w:ascii="Arial" w:hAnsi="Arial" w:cs="Arial"/>
               </w:rPr>
-              <w:t xml:space="preserve">, continuo </w:t>
-            </w:r>
-            <w:proofErr w:type="spellStart"/>
-            <w:r>
-              <w:rPr>
-                <w:rFonts w:ascii="Arial" w:hAnsi="Arial" w:cs="Arial"/>
-              </w:rPr>
-              <w:t>mockup</w:t>
-            </w:r>
-            <w:proofErr w:type="spellEnd"/>
-            <w:r>
-              <w:rPr>
-                <w:rFonts w:ascii="Arial" w:hAnsi="Arial" w:cs="Arial"/>
-              </w:rPr>
-              <w:t xml:space="preserve"> e grafica, sviluppo Activity </w:t>
-            </w:r>
-            <w:proofErr w:type="spellStart"/>
-            <w:r>
-              <w:rPr>
-                <w:rFonts w:ascii="Arial" w:hAnsi="Arial" w:cs="Arial"/>
-              </w:rPr>
-              <w:t>Diagram</w:t>
-            </w:r>
-            <w:proofErr w:type="spellEnd"/>
+              <w:t>, continuo mockup e grafica, sviluppo Activity Diagram</w:t>
+            </w:r>
             <w:r>
               <w:rPr>
                 <w:rFonts w:ascii="Arial" w:hAnsi="Arial" w:cs="Arial"/>
@@ -1449,49 +1399,7 @@
               <w:rPr>
                 <w:rFonts w:ascii="Arial" w:hAnsi="Arial" w:cs="Arial"/>
               </w:rPr>
-              <w:t xml:space="preserve">Abbiamo completato la fase di ricerca, definendo lo use case e i relativi </w:t>
-            </w:r>
-            <w:proofErr w:type="spellStart"/>
-            <w:r>
-              <w:rPr>
-                <w:rFonts w:ascii="Arial" w:hAnsi="Arial" w:cs="Arial"/>
-              </w:rPr>
-              <w:t>swimlane</w:t>
-            </w:r>
-            <w:proofErr w:type="spellEnd"/>
-            <w:r>
-              <w:rPr>
-                <w:rFonts w:ascii="Arial" w:hAnsi="Arial" w:cs="Arial"/>
-              </w:rPr>
-              <w:t xml:space="preserve"> </w:t>
-            </w:r>
-            <w:proofErr w:type="spellStart"/>
-            <w:r>
-              <w:rPr>
-                <w:rFonts w:ascii="Arial" w:hAnsi="Arial" w:cs="Arial"/>
-              </w:rPr>
-              <w:t>diagram</w:t>
-            </w:r>
-            <w:proofErr w:type="spellEnd"/>
-            <w:r>
-              <w:rPr>
-                <w:rFonts w:ascii="Arial" w:hAnsi="Arial" w:cs="Arial"/>
-              </w:rPr>
-              <w:t xml:space="preserve">. La documentazione è stata integrata con l’analisi del dominio, lo scopo del progetto e le descrizioni dettagliate dei processi. Infine, abbiamo redatto e incluso il diagramma di </w:t>
-            </w:r>
-            <w:proofErr w:type="spellStart"/>
-            <w:r>
-              <w:rPr>
-                <w:rFonts w:ascii="Arial" w:hAnsi="Arial" w:cs="Arial"/>
-              </w:rPr>
-              <w:t>Gantt</w:t>
-            </w:r>
-            <w:proofErr w:type="spellEnd"/>
-            <w:r>
-              <w:rPr>
-                <w:rFonts w:ascii="Arial" w:hAnsi="Arial" w:cs="Arial"/>
-              </w:rPr>
-              <w:t xml:space="preserve"> preventivo.</w:t>
+              <w:t>Abbiamo completato la fase di ricerca, definendo lo use case e i relativi swimlane diagram. La documentazione è stata integrata con l’analisi del dominio, lo scopo del progetto e le descrizioni dettagliate dei processi. Infine, abbiamo redatto e incluso il diagramma di Gantt preventivo.</w:t>
             </w:r>
             <w:r>
               <w:rPr>
@@ -1951,35 +1859,7 @@
                 <w:rFonts w:ascii="Arial" w:hAnsi="Arial" w:cs="Arial"/>
               </w:rPr>
               <w:br/>
-              <w:t xml:space="preserve">Abbiamo fatto ricerche su come cambiare impostazioni specifiche in </w:t>
-            </w:r>
-            <w:proofErr w:type="spellStart"/>
-            <w:r>
-              <w:rPr>
-                <w:rFonts w:ascii="Arial" w:hAnsi="Arial" w:cs="Arial"/>
-              </w:rPr>
-              <w:t>GameMaker</w:t>
-            </w:r>
-            <w:proofErr w:type="spellEnd"/>
-            <w:r>
-              <w:rPr>
-                <w:rFonts w:ascii="Arial" w:hAnsi="Arial" w:cs="Arial"/>
-              </w:rPr>
-              <w:t xml:space="preserve">, su funzionamenti avanzati di </w:t>
-            </w:r>
-            <w:proofErr w:type="spellStart"/>
-            <w:r>
-              <w:rPr>
-                <w:rFonts w:ascii="Arial" w:hAnsi="Arial" w:cs="Arial"/>
-              </w:rPr>
-              <w:t>git</w:t>
-            </w:r>
-            <w:proofErr w:type="spellEnd"/>
-            <w:r>
-              <w:rPr>
-                <w:rFonts w:ascii="Arial" w:hAnsi="Arial" w:cs="Arial"/>
-              </w:rPr>
-              <w:t xml:space="preserve"> per evitare conflitti.</w:t>
+              <w:t>Abbiamo fatto ricerche su come cambiare impostazioni specifiche in GameMaker, su funzionamenti avanzati di git per evitare conflitti.</w:t>
             </w:r>
             <w:r>
               <w:rPr>
@@ -2074,49 +1954,7 @@
               <w:rPr>
                 <w:rFonts w:ascii="Arial" w:hAnsi="Arial" w:cs="Arial"/>
               </w:rPr>
-              <w:t xml:space="preserve">Problemi con l’organizzazione delle versioni su </w:t>
-            </w:r>
-            <w:proofErr w:type="spellStart"/>
-            <w:r>
-              <w:rPr>
-                <w:rFonts w:ascii="Arial" w:hAnsi="Arial" w:cs="Arial"/>
-              </w:rPr>
-              <w:t>github</w:t>
-            </w:r>
-            <w:proofErr w:type="spellEnd"/>
-            <w:r>
-              <w:rPr>
-                <w:rFonts w:ascii="Arial" w:hAnsi="Arial" w:cs="Arial"/>
-              </w:rPr>
-              <w:t xml:space="preserve">, ci sono stati dei file che in alcune situazioni venivano modificati da più persone, e questo provocava problemi di </w:t>
-            </w:r>
-            <w:proofErr w:type="spellStart"/>
-            <w:r>
-              <w:rPr>
-                <w:rFonts w:ascii="Arial" w:hAnsi="Arial" w:cs="Arial"/>
-              </w:rPr>
-              <w:t>merging</w:t>
-            </w:r>
-            <w:proofErr w:type="spellEnd"/>
-            <w:r>
-              <w:rPr>
-                <w:rFonts w:ascii="Arial" w:hAnsi="Arial" w:cs="Arial"/>
-              </w:rPr>
-              <w:t xml:space="preserve"> da parte di GitHub. Per risolvere abbiamo dovuto riprendere un </w:t>
-            </w:r>
-            <w:proofErr w:type="spellStart"/>
-            <w:r>
-              <w:rPr>
-                <w:rFonts w:ascii="Arial" w:hAnsi="Arial" w:cs="Arial"/>
-              </w:rPr>
-              <w:t>push</w:t>
-            </w:r>
-            <w:proofErr w:type="spellEnd"/>
-            <w:r>
-              <w:rPr>
-                <w:rFonts w:ascii="Arial" w:hAnsi="Arial" w:cs="Arial"/>
-              </w:rPr>
-              <w:t xml:space="preserve"> vecchio ed allinearci tutti ad esso, per evitare il più possibile i conflitti.</w:t>
+              <w:t>Problemi con l’organizzazione delle versioni su github, ci sono stati dei file che in alcune situazioni venivano modificati da più persone, e questo provocava problemi di merging da parte di GitHub. Per risolvere abbiamo dovuto riprendere un push vecchio ed allinearci tutti ad esso, per evitare il più possibile i conflitti.</w:t>
             </w:r>
           </w:p>
         </w:tc>
@@ -2319,28 +2157,12 @@
                 <w:rFonts w:ascii="Arial" w:hAnsi="Arial" w:cs="Arial"/>
               </w:rPr>
             </w:pPr>
-            <w:proofErr w:type="spellStart"/>
-            <w:r>
-              <w:rPr>
-                <w:rFonts w:ascii="Arial" w:hAnsi="Arial" w:cs="Arial"/>
-              </w:rPr>
-              <w:t>Daily</w:t>
-            </w:r>
-            <w:proofErr w:type="spellEnd"/>
-            <w:r>
-              <w:rPr>
-                <w:rFonts w:ascii="Arial" w:hAnsi="Arial" w:cs="Arial"/>
-              </w:rPr>
-              <w:t xml:space="preserve"> </w:t>
-            </w:r>
-            <w:proofErr w:type="spellStart"/>
-            <w:r>
-              <w:rPr>
-                <w:rFonts w:ascii="Arial" w:hAnsi="Arial" w:cs="Arial"/>
-              </w:rPr>
-              <w:t>Scrum</w:t>
-            </w:r>
-            <w:proofErr w:type="spellEnd"/>
+            <w:r>
+              <w:rPr>
+                <w:rFonts w:ascii="Arial" w:hAnsi="Arial" w:cs="Arial"/>
+              </w:rPr>
+              <w:t>Daily Scrum</w:t>
+            </w:r>
           </w:p>
         </w:tc>
       </w:tr>
@@ -2508,16 +2330,8 @@
               <w:rPr>
                 <w:rFonts w:ascii="Arial" w:hAnsi="Arial" w:cs="Arial"/>
               </w:rPr>
-              <w:t xml:space="preserve">Sprint </w:t>
-            </w:r>
-            <w:proofErr w:type="spellStart"/>
-            <w:r>
-              <w:rPr>
-                <w:rFonts w:ascii="Arial" w:hAnsi="Arial" w:cs="Arial"/>
-              </w:rPr>
-              <w:t>Retrospective</w:t>
-            </w:r>
-            <w:proofErr w:type="spellEnd"/>
+              <w:t>Sprint Retrospective</w:t>
+            </w:r>
           </w:p>
         </w:tc>
       </w:tr>
@@ -2841,77 +2655,7 @@
               <w:rPr>
                 <w:rFonts w:ascii="Arial" w:hAnsi="Arial" w:cs="Arial"/>
               </w:rPr>
-              <w:t xml:space="preserve">Abbiamo avuto problemi con le collisioni nel menu (dentro </w:t>
-            </w:r>
-            <w:proofErr w:type="spellStart"/>
-            <w:r>
-              <w:rPr>
-                <w:rFonts w:ascii="Arial" w:hAnsi="Arial" w:cs="Arial"/>
-              </w:rPr>
-              <w:t>GameMaker</w:t>
-            </w:r>
-            <w:proofErr w:type="spellEnd"/>
-            <w:r>
-              <w:rPr>
-                <w:rFonts w:ascii="Arial" w:hAnsi="Arial" w:cs="Arial"/>
-              </w:rPr>
-              <w:t xml:space="preserve">) in certi bottoni mentre li mappavamo per le interazioni, questo perché inserendo una </w:t>
-            </w:r>
-            <w:proofErr w:type="spellStart"/>
-            <w:r>
-              <w:rPr>
-                <w:rFonts w:ascii="Arial" w:hAnsi="Arial" w:cs="Arial"/>
-              </w:rPr>
-              <w:t>sprite</w:t>
-            </w:r>
-            <w:proofErr w:type="spellEnd"/>
-            <w:r>
-              <w:rPr>
-                <w:rFonts w:ascii="Arial" w:hAnsi="Arial" w:cs="Arial"/>
-              </w:rPr>
-              <w:t xml:space="preserve"> invisibile solo come maschera di collisione quando si modificano le dimensioni dell’oggetto non si vanno a modificare anche le collisioni della </w:t>
-            </w:r>
-            <w:proofErr w:type="spellStart"/>
-            <w:r>
-              <w:rPr>
-                <w:rFonts w:ascii="Arial" w:hAnsi="Arial" w:cs="Arial"/>
-              </w:rPr>
-              <w:t>sprite</w:t>
-            </w:r>
-            <w:proofErr w:type="spellEnd"/>
-            <w:r>
-              <w:rPr>
-                <w:rFonts w:ascii="Arial" w:hAnsi="Arial" w:cs="Arial"/>
-              </w:rPr>
-              <w:t xml:space="preserve">, quindi basta semplicemente inserire la </w:t>
-            </w:r>
-            <w:proofErr w:type="spellStart"/>
-            <w:r>
-              <w:rPr>
-                <w:rFonts w:ascii="Arial" w:hAnsi="Arial" w:cs="Arial"/>
-              </w:rPr>
-              <w:t>sprite</w:t>
-            </w:r>
-            <w:proofErr w:type="spellEnd"/>
-            <w:r>
-              <w:rPr>
-                <w:rFonts w:ascii="Arial" w:hAnsi="Arial" w:cs="Arial"/>
-              </w:rPr>
-              <w:t xml:space="preserve"> anche come “</w:t>
-            </w:r>
-            <w:proofErr w:type="spellStart"/>
-            <w:r>
-              <w:rPr>
-                <w:rFonts w:ascii="Arial" w:hAnsi="Arial" w:cs="Arial"/>
-              </w:rPr>
-              <w:t>sprite</w:t>
-            </w:r>
-            <w:proofErr w:type="spellEnd"/>
-            <w:r>
-              <w:rPr>
-                <w:rFonts w:ascii="Arial" w:hAnsi="Arial" w:cs="Arial"/>
-              </w:rPr>
-              <w:t xml:space="preserve"> effettiva” dell’oggetto in questione</w:t>
+              <w:t>Abbiamo avuto problemi con le collisioni nel menu (dentro GameMaker) in certi bottoni mentre li mappavamo per le interazioni, questo perché inserendo una sprite invisibile solo come maschera di collisione quando si modificano le dimensioni dell’oggetto non si vanno a modificare anche le collisioni della sprite, quindi basta semplicemente inserire la sprite anche come “sprite effettiva” dell’oggetto in questione</w:t>
             </w:r>
           </w:p>
         </w:tc>
@@ -3119,28 +2863,12 @@
                 <w:rFonts w:ascii="Arial" w:hAnsi="Arial" w:cs="Arial"/>
               </w:rPr>
             </w:pPr>
-            <w:proofErr w:type="spellStart"/>
-            <w:r>
-              <w:rPr>
-                <w:rFonts w:ascii="Arial" w:hAnsi="Arial" w:cs="Arial"/>
-              </w:rPr>
-              <w:t>Daily</w:t>
-            </w:r>
-            <w:proofErr w:type="spellEnd"/>
-            <w:r>
-              <w:rPr>
-                <w:rFonts w:ascii="Arial" w:hAnsi="Arial" w:cs="Arial"/>
-              </w:rPr>
-              <w:t xml:space="preserve"> </w:t>
-            </w:r>
-            <w:proofErr w:type="spellStart"/>
-            <w:r>
-              <w:rPr>
-                <w:rFonts w:ascii="Arial" w:hAnsi="Arial" w:cs="Arial"/>
-              </w:rPr>
-              <w:t>Scrum</w:t>
-            </w:r>
-            <w:proofErr w:type="spellEnd"/>
+            <w:r>
+              <w:rPr>
+                <w:rFonts w:ascii="Arial" w:hAnsi="Arial" w:cs="Arial"/>
+              </w:rPr>
+              <w:t>Daily Scrum</w:t>
+            </w:r>
           </w:p>
         </w:tc>
       </w:tr>
@@ -3308,16 +3036,8 @@
               <w:rPr>
                 <w:rFonts w:ascii="Arial" w:hAnsi="Arial" w:cs="Arial"/>
               </w:rPr>
-              <w:t xml:space="preserve">Sprint </w:t>
-            </w:r>
-            <w:proofErr w:type="spellStart"/>
-            <w:r>
-              <w:rPr>
-                <w:rFonts w:ascii="Arial" w:hAnsi="Arial" w:cs="Arial"/>
-              </w:rPr>
-              <w:t>Retrospective</w:t>
-            </w:r>
-            <w:proofErr w:type="spellEnd"/>
+              <w:t>Sprint Retrospective</w:t>
+            </w:r>
           </w:p>
         </w:tc>
       </w:tr>
@@ -3336,13 +3056,6 @@
         </w:tc>
       </w:tr>
     </w:tbl>
-    <w:p>
-      <w:pPr>
-        <w:rPr>
-          <w:rFonts w:ascii="Arial" w:hAnsi="Arial" w:cs="Arial"/>
-        </w:rPr>
-      </w:pPr>
-    </w:p>
     <w:p>
       <w:pPr>
         <w:rPr>
@@ -3387,6 +3100,7 @@
               <w:rPr>
                 <w:rFonts w:ascii="Arial" w:hAnsi="Arial" w:cs="Arial"/>
               </w:rPr>
+              <w:lastRenderedPageBreak/>
               <w:t>Luogo</w:t>
             </w:r>
           </w:p>
@@ -3473,13 +3187,7 @@
               <w:rPr>
                 <w:rFonts w:ascii="Arial" w:hAnsi="Arial" w:cs="Arial"/>
               </w:rPr>
-              <w:t>13</w:t>
-            </w:r>
-            <w:r>
-              <w:rPr>
-                <w:rFonts w:ascii="Arial" w:hAnsi="Arial" w:cs="Arial"/>
-              </w:rPr>
-              <w:t>.03</w:t>
+              <w:t>13.03</w:t>
             </w:r>
             <w:r>
               <w:rPr>
@@ -3558,21 +3266,7 @@
               <w:rPr>
                 <w:rFonts w:ascii="Arial" w:hAnsi="Arial" w:cs="Arial"/>
               </w:rPr>
-              <w:t xml:space="preserve">Oggi abbiamo definitivamente completato il </w:t>
-            </w:r>
-            <w:proofErr w:type="spellStart"/>
-            <w:r>
-              <w:rPr>
-                <w:rFonts w:ascii="Arial" w:hAnsi="Arial" w:cs="Arial"/>
-              </w:rPr>
-              <w:t>backend</w:t>
-            </w:r>
-            <w:proofErr w:type="spellEnd"/>
-            <w:r>
-              <w:rPr>
-                <w:rFonts w:ascii="Arial" w:hAnsi="Arial" w:cs="Arial"/>
-              </w:rPr>
-              <w:t xml:space="preserve"> di tutte le impostazioni, aggiungendo il controllo del contrasto, la modalità schermo intero e tutto il sistema di ridimensionamento dello schermo.</w:t>
+              <w:t>Oggi abbiamo definitivamente completato il backend di tutte le impostazioni, aggiungendo il controllo del contrasto, la modalità schermo intero e tutto il sistema di ridimensionamento dello schermo.</w:t>
             </w:r>
           </w:p>
           <w:p>
@@ -3660,21 +3354,7 @@
               <w:rPr>
                 <w:rFonts w:ascii="Arial" w:hAnsi="Arial" w:cs="Arial"/>
               </w:rPr>
-              <w:t xml:space="preserve">Oggi abbiamo definitivamente completato la creazione del </w:t>
-            </w:r>
-            <w:proofErr w:type="spellStart"/>
-            <w:r>
-              <w:rPr>
-                <w:rFonts w:ascii="Arial" w:hAnsi="Arial" w:cs="Arial"/>
-              </w:rPr>
-              <w:t>backend</w:t>
-            </w:r>
-            <w:proofErr w:type="spellEnd"/>
-            <w:r>
-              <w:rPr>
-                <w:rFonts w:ascii="Arial" w:hAnsi="Arial" w:cs="Arial"/>
-              </w:rPr>
-              <w:t xml:space="preserve"> di tutte le impostazioni, aggiungendo il contrasto, la modalità schermo intero e tutto il sistema di ridimensionamento. Inoltre abbiamo iniziato a sviluppare la logica per l’avvio della partita e abbiamo continuato a lavorare sulla grafica del gioco.</w:t>
+              <w:t>Oggi abbiamo definitivamente completato la creazione del backend di tutte le impostazioni, aggiungendo il contrasto, la modalità schermo intero e tutto il sistema di ridimensionamento. Inoltre abbiamo iniziato a sviluppare la logica per l’avvio della partita e abbiamo continuato a lavorare sulla grafica del gioco.</w:t>
             </w:r>
           </w:p>
         </w:tc>
@@ -3876,28 +3556,12 @@
                 <w:rFonts w:ascii="Arial" w:hAnsi="Arial" w:cs="Arial"/>
               </w:rPr>
             </w:pPr>
-            <w:proofErr w:type="spellStart"/>
-            <w:r>
-              <w:rPr>
-                <w:rFonts w:ascii="Arial" w:hAnsi="Arial" w:cs="Arial"/>
-              </w:rPr>
-              <w:t>Daily</w:t>
-            </w:r>
-            <w:proofErr w:type="spellEnd"/>
-            <w:r>
-              <w:rPr>
-                <w:rFonts w:ascii="Arial" w:hAnsi="Arial" w:cs="Arial"/>
-              </w:rPr>
-              <w:t xml:space="preserve"> </w:t>
-            </w:r>
-            <w:proofErr w:type="spellStart"/>
-            <w:r>
-              <w:rPr>
-                <w:rFonts w:ascii="Arial" w:hAnsi="Arial" w:cs="Arial"/>
-              </w:rPr>
-              <w:t>Scrum</w:t>
-            </w:r>
-            <w:proofErr w:type="spellEnd"/>
+            <w:r>
+              <w:rPr>
+                <w:rFonts w:ascii="Arial" w:hAnsi="Arial" w:cs="Arial"/>
+              </w:rPr>
+              <w:t>Daily Scrum</w:t>
+            </w:r>
           </w:p>
         </w:tc>
       </w:tr>
@@ -3981,21 +3645,7 @@
               <w:rPr>
                 <w:rFonts w:ascii="Arial" w:hAnsi="Arial" w:cs="Arial"/>
               </w:rPr>
-              <w:t xml:space="preserve">Nel planning abbiamo deciso di recuperare le parti mancanti e continuare con il </w:t>
-            </w:r>
-            <w:proofErr w:type="spellStart"/>
-            <w:r>
-              <w:rPr>
-                <w:rFonts w:ascii="Arial" w:hAnsi="Arial" w:cs="Arial"/>
-              </w:rPr>
-              <w:t>prino</w:t>
-            </w:r>
-            <w:proofErr w:type="spellEnd"/>
-            <w:r>
-              <w:rPr>
-                <w:rFonts w:ascii="Arial" w:hAnsi="Arial" w:cs="Arial"/>
-              </w:rPr>
-              <w:t xml:space="preserve"> originale </w:t>
+              <w:t>Abbiamo recuperato le User Stories non completate inserendole nel nuovo Sprint..</w:t>
             </w:r>
           </w:p>
         </w:tc>
@@ -4055,45 +3705,35 @@
               </w:rPr>
               <w:t xml:space="preserve">Ci siamo ritrovati in dietro rispetto a </w:t>
             </w:r>
-            <w:proofErr w:type="spellStart"/>
-            <w:r>
-              <w:rPr>
-                <w:rFonts w:ascii="Arial" w:hAnsi="Arial" w:cs="Arial"/>
-              </w:rPr>
-              <w:t>cio</w:t>
-            </w:r>
-            <w:proofErr w:type="spellEnd"/>
-            <w:r>
-              <w:rPr>
-                <w:rFonts w:ascii="Arial" w:hAnsi="Arial" w:cs="Arial"/>
-              </w:rPr>
-              <w:t xml:space="preserve"> che ci eravamo pianificato di fare, abbiamo notato mancanze rispetto alla</w:t>
-            </w:r>
-            <w:r>
-              <w:rPr>
-                <w:rFonts w:ascii="Arial" w:hAnsi="Arial" w:cs="Arial"/>
-              </w:rPr>
-              <w:t xml:space="preserve"> documentazione </w:t>
-            </w:r>
-            <w:r>
-              <w:rPr>
-                <w:rFonts w:ascii="Arial" w:hAnsi="Arial" w:cs="Arial"/>
-              </w:rPr>
-              <w:t xml:space="preserve">e il </w:t>
-            </w:r>
-            <w:proofErr w:type="spellStart"/>
-            <w:r>
-              <w:rPr>
-                <w:rFonts w:ascii="Arial" w:hAnsi="Arial" w:cs="Arial"/>
-              </w:rPr>
-              <w:t>planing</w:t>
-            </w:r>
-            <w:proofErr w:type="spellEnd"/>
-            <w:r>
-              <w:rPr>
-                <w:rFonts w:ascii="Arial" w:hAnsi="Arial" w:cs="Arial"/>
-              </w:rPr>
-              <w:t xml:space="preserve"> dei vari sprint </w:t>
+            <w:r>
+              <w:rPr>
+                <w:rFonts w:ascii="Arial" w:hAnsi="Arial" w:cs="Arial"/>
+              </w:rPr>
+              <w:t>ciò</w:t>
+            </w:r>
+            <w:r>
+              <w:rPr>
+                <w:rFonts w:ascii="Arial" w:hAnsi="Arial" w:cs="Arial"/>
+              </w:rPr>
+              <w:t xml:space="preserve"> che ci eravamo pianificat</w:t>
+            </w:r>
+            <w:r>
+              <w:rPr>
+                <w:rFonts w:ascii="Arial" w:hAnsi="Arial" w:cs="Arial"/>
+              </w:rPr>
+              <w:t>i</w:t>
+            </w:r>
+            <w:r>
+              <w:rPr>
+                <w:rFonts w:ascii="Arial" w:hAnsi="Arial" w:cs="Arial"/>
+              </w:rPr>
+              <w:t xml:space="preserve"> di fare, abbiamo notato mancanze</w:t>
+            </w:r>
+            <w:r>
+              <w:rPr>
+                <w:rFonts w:ascii="Arial" w:hAnsi="Arial" w:cs="Arial"/>
+              </w:rPr>
+              <w:t xml:space="preserve"> e capito dove migliorare per il prossimo Sprint</w:t>
             </w:r>
           </w:p>
         </w:tc>
@@ -4131,16 +3771,669 @@
               <w:rPr>
                 <w:rFonts w:ascii="Arial" w:hAnsi="Arial" w:cs="Arial"/>
               </w:rPr>
-              <w:t xml:space="preserve">Sprint </w:t>
-            </w:r>
-            <w:proofErr w:type="spellStart"/>
-            <w:r>
-              <w:rPr>
-                <w:rFonts w:ascii="Arial" w:hAnsi="Arial" w:cs="Arial"/>
-              </w:rPr>
-              <w:t>Retrospective</w:t>
-            </w:r>
-            <w:proofErr w:type="spellEnd"/>
+              <w:t>Sprint Retrospective</w:t>
+            </w:r>
+          </w:p>
+        </w:tc>
+      </w:tr>
+      <w:tr>
+        <w:tc>
+          <w:tcPr>
+            <w:tcW w:w="9854" w:type="dxa"/>
+          </w:tcPr>
+          <w:p>
+            <w:pPr>
+              <w:rPr>
+                <w:rFonts w:ascii="Arial" w:hAnsi="Arial" w:cs="Arial"/>
+              </w:rPr>
+            </w:pPr>
+            <w:r>
+              <w:rPr>
+                <w:rFonts w:ascii="Arial" w:hAnsi="Arial" w:cs="Arial"/>
+              </w:rPr>
+              <w:t>A causa di mancanza di conoscenza nel linguaggio ci siamo ritrovati a dedicare maggior tempo ad alcune User Stories.</w:t>
+            </w:r>
+          </w:p>
+        </w:tc>
+      </w:tr>
+    </w:tbl>
+    <w:p>
+      <w:pPr>
+        <w:rPr>
+          <w:rFonts w:ascii="Arial" w:hAnsi="Arial" w:cs="Arial"/>
+        </w:rPr>
+      </w:pPr>
+      <w:r>
+        <w:rPr>
+          <w:rFonts w:ascii="Arial" w:hAnsi="Arial" w:cs="Arial"/>
+        </w:rPr>
+        <w:br w:type="page"/>
+      </w:r>
+    </w:p>
+    <w:tbl>
+      <w:tblPr>
+        <w:tblStyle w:val="Grigliatabella"/>
+        <w:tblW w:w="9634" w:type="dxa"/>
+        <w:tblLook w:val="04A0" w:firstRow="1" w:lastRow="0" w:firstColumn="1" w:lastColumn="0" w:noHBand="0" w:noVBand="1"/>
+      </w:tblPr>
+      <w:tblGrid>
+        <w:gridCol w:w="4803"/>
+        <w:gridCol w:w="4831"/>
+      </w:tblGrid>
+      <w:tr>
+        <w:trPr>
+          <w:trHeight w:hRule="exact" w:val="397"/>
+        </w:trPr>
+        <w:tc>
+          <w:tcPr>
+            <w:tcW w:w="4803" w:type="dxa"/>
+            <w:tcBorders>
+              <w:top w:val="single" w:sz="4" w:space="0" w:color="auto"/>
+              <w:left w:val="single" w:sz="4" w:space="0" w:color="auto"/>
+              <w:bottom w:val="single" w:sz="4" w:space="0" w:color="auto"/>
+              <w:right w:val="single" w:sz="4" w:space="0" w:color="auto"/>
+            </w:tcBorders>
+            <w:vAlign w:val="center"/>
+            <w:hideMark/>
+          </w:tcPr>
+          <w:p>
+            <w:pPr>
+              <w:spacing w:after="200" w:line="276" w:lineRule="auto"/>
+              <w:rPr>
+                <w:rFonts w:ascii="Arial" w:hAnsi="Arial" w:cs="Arial"/>
+              </w:rPr>
+            </w:pPr>
+            <w:r>
+              <w:rPr>
+                <w:rFonts w:ascii="Arial" w:hAnsi="Arial" w:cs="Arial"/>
+              </w:rPr>
+              <w:lastRenderedPageBreak/>
+              <w:t>Luogo</w:t>
+            </w:r>
+          </w:p>
+        </w:tc>
+        <w:tc>
+          <w:tcPr>
+            <w:tcW w:w="4831" w:type="dxa"/>
+            <w:tcBorders>
+              <w:top w:val="single" w:sz="4" w:space="0" w:color="auto"/>
+              <w:left w:val="single" w:sz="4" w:space="0" w:color="auto"/>
+              <w:bottom w:val="single" w:sz="4" w:space="0" w:color="auto"/>
+              <w:right w:val="single" w:sz="4" w:space="0" w:color="auto"/>
+            </w:tcBorders>
+            <w:vAlign w:val="center"/>
+            <w:hideMark/>
+          </w:tcPr>
+          <w:p>
+            <w:pPr>
+              <w:spacing w:after="200" w:line="276" w:lineRule="auto"/>
+              <w:rPr>
+                <w:rFonts w:ascii="Arial" w:hAnsi="Arial" w:cs="Arial"/>
+              </w:rPr>
+            </w:pPr>
+            <w:r>
+              <w:rPr>
+                <w:rFonts w:ascii="Arial" w:hAnsi="Arial" w:cs="Arial"/>
+              </w:rPr>
+              <w:t>Canobbio</w:t>
+            </w:r>
+          </w:p>
+        </w:tc>
+      </w:tr>
+      <w:tr>
+        <w:trPr>
+          <w:trHeight w:hRule="exact" w:val="397"/>
+        </w:trPr>
+        <w:tc>
+          <w:tcPr>
+            <w:tcW w:w="4803" w:type="dxa"/>
+            <w:tcBorders>
+              <w:top w:val="single" w:sz="4" w:space="0" w:color="auto"/>
+              <w:left w:val="single" w:sz="4" w:space="0" w:color="auto"/>
+              <w:bottom w:val="single" w:sz="4" w:space="0" w:color="auto"/>
+              <w:right w:val="single" w:sz="4" w:space="0" w:color="auto"/>
+            </w:tcBorders>
+            <w:vAlign w:val="center"/>
+            <w:hideMark/>
+          </w:tcPr>
+          <w:p>
+            <w:pPr>
+              <w:spacing w:after="200" w:line="276" w:lineRule="auto"/>
+              <w:rPr>
+                <w:rFonts w:ascii="Arial" w:hAnsi="Arial" w:cs="Arial"/>
+              </w:rPr>
+            </w:pPr>
+            <w:r>
+              <w:rPr>
+                <w:rFonts w:ascii="Arial" w:hAnsi="Arial" w:cs="Arial"/>
+              </w:rPr>
+              <w:t>Data</w:t>
+            </w:r>
+          </w:p>
+        </w:tc>
+        <w:tc>
+          <w:tcPr>
+            <w:tcW w:w="4831" w:type="dxa"/>
+            <w:tcBorders>
+              <w:top w:val="single" w:sz="4" w:space="0" w:color="auto"/>
+              <w:left w:val="single" w:sz="4" w:space="0" w:color="auto"/>
+              <w:bottom w:val="single" w:sz="4" w:space="0" w:color="auto"/>
+              <w:right w:val="single" w:sz="4" w:space="0" w:color="auto"/>
+            </w:tcBorders>
+            <w:vAlign w:val="center"/>
+            <w:hideMark/>
+          </w:tcPr>
+          <w:p>
+            <w:pPr>
+              <w:spacing w:after="200" w:line="276" w:lineRule="auto"/>
+              <w:rPr>
+                <w:rFonts w:ascii="Arial" w:hAnsi="Arial" w:cs="Arial"/>
+              </w:rPr>
+            </w:pPr>
+            <w:r>
+              <w:rPr>
+                <w:rFonts w:ascii="Arial" w:hAnsi="Arial" w:cs="Arial"/>
+              </w:rPr>
+              <w:t>20.03.2026</w:t>
+            </w:r>
+          </w:p>
+        </w:tc>
+      </w:tr>
+    </w:tbl>
+    <w:p>
+      <w:pPr>
+        <w:rPr>
+          <w:rFonts w:ascii="Arial" w:hAnsi="Arial" w:cs="Arial"/>
+        </w:rPr>
+      </w:pPr>
+    </w:p>
+    <w:tbl>
+      <w:tblPr>
+        <w:tblStyle w:val="Grigliatabella"/>
+        <w:tblW w:w="0" w:type="auto"/>
+        <w:tblLook w:val="04A0" w:firstRow="1" w:lastRow="0" w:firstColumn="1" w:lastColumn="0" w:noHBand="0" w:noVBand="1"/>
+      </w:tblPr>
+      <w:tblGrid>
+        <w:gridCol w:w="9628"/>
+      </w:tblGrid>
+      <w:tr>
+        <w:tc>
+          <w:tcPr>
+            <w:tcW w:w="9854" w:type="dxa"/>
+            <w:tcBorders>
+              <w:top w:val="single" w:sz="4" w:space="0" w:color="auto"/>
+              <w:left w:val="single" w:sz="4" w:space="0" w:color="auto"/>
+              <w:bottom w:val="single" w:sz="4" w:space="0" w:color="auto"/>
+              <w:right w:val="single" w:sz="4" w:space="0" w:color="auto"/>
+            </w:tcBorders>
+            <w:shd w:val="clear" w:color="auto" w:fill="D9D9D9" w:themeFill="background1" w:themeFillShade="D9"/>
+            <w:hideMark/>
+          </w:tcPr>
+          <w:p>
+            <w:pPr>
+              <w:spacing w:after="200" w:line="276" w:lineRule="auto"/>
+              <w:rPr>
+                <w:rFonts w:ascii="Arial" w:hAnsi="Arial" w:cs="Arial"/>
+              </w:rPr>
+            </w:pPr>
+            <w:r>
+              <w:rPr>
+                <w:rFonts w:ascii="Arial" w:hAnsi="Arial" w:cs="Arial"/>
+              </w:rPr>
+              <w:t>Lavori svolti</w:t>
+            </w:r>
+          </w:p>
+        </w:tc>
+      </w:tr>
+      <w:tr>
+        <w:tc>
+          <w:tcPr>
+            <w:tcW w:w="9854" w:type="dxa"/>
+            <w:tcBorders>
+              <w:top w:val="single" w:sz="4" w:space="0" w:color="auto"/>
+              <w:left w:val="single" w:sz="4" w:space="0" w:color="auto"/>
+              <w:bottom w:val="single" w:sz="4" w:space="0" w:color="auto"/>
+              <w:right w:val="single" w:sz="4" w:space="0" w:color="auto"/>
+            </w:tcBorders>
+            <w:hideMark/>
+          </w:tcPr>
+          <w:p>
+            <w:pPr>
+              <w:spacing w:after="200" w:line="276" w:lineRule="auto"/>
+              <w:rPr>
+                <w:rFonts w:ascii="Arial" w:hAnsi="Arial" w:cs="Arial"/>
+              </w:rPr>
+            </w:pPr>
+          </w:p>
+        </w:tc>
+      </w:tr>
+    </w:tbl>
+    <w:p>
+      <w:pPr>
+        <w:rPr>
+          <w:rFonts w:ascii="Arial" w:hAnsi="Arial" w:cs="Arial"/>
+        </w:rPr>
+      </w:pPr>
+    </w:p>
+    <w:tbl>
+      <w:tblPr>
+        <w:tblStyle w:val="Grigliatabella"/>
+        <w:tblW w:w="0" w:type="auto"/>
+        <w:tblLook w:val="04A0" w:firstRow="1" w:lastRow="0" w:firstColumn="1" w:lastColumn="0" w:noHBand="0" w:noVBand="1"/>
+      </w:tblPr>
+      <w:tblGrid>
+        <w:gridCol w:w="9628"/>
+      </w:tblGrid>
+      <w:tr>
+        <w:tc>
+          <w:tcPr>
+            <w:tcW w:w="9854" w:type="dxa"/>
+            <w:tcBorders>
+              <w:top w:val="single" w:sz="4" w:space="0" w:color="auto"/>
+              <w:left w:val="single" w:sz="4" w:space="0" w:color="auto"/>
+              <w:bottom w:val="single" w:sz="4" w:space="0" w:color="auto"/>
+              <w:right w:val="single" w:sz="4" w:space="0" w:color="auto"/>
+            </w:tcBorders>
+            <w:shd w:val="clear" w:color="auto" w:fill="D9D9D9" w:themeFill="background1" w:themeFillShade="D9"/>
+            <w:hideMark/>
+          </w:tcPr>
+          <w:p>
+            <w:pPr>
+              <w:spacing w:after="200" w:line="276" w:lineRule="auto"/>
+              <w:rPr>
+                <w:rFonts w:ascii="Arial" w:hAnsi="Arial" w:cs="Arial"/>
+              </w:rPr>
+            </w:pPr>
+            <w:r>
+              <w:rPr>
+                <w:rFonts w:ascii="Arial" w:hAnsi="Arial" w:cs="Arial"/>
+              </w:rPr>
+              <w:t>Problemi riscontrati e soluzioni adottate</w:t>
+            </w:r>
+          </w:p>
+        </w:tc>
+      </w:tr>
+      <w:tr>
+        <w:tc>
+          <w:tcPr>
+            <w:tcW w:w="9854" w:type="dxa"/>
+            <w:tcBorders>
+              <w:top w:val="single" w:sz="4" w:space="0" w:color="auto"/>
+              <w:left w:val="single" w:sz="4" w:space="0" w:color="auto"/>
+              <w:bottom w:val="single" w:sz="4" w:space="0" w:color="auto"/>
+              <w:right w:val="single" w:sz="4" w:space="0" w:color="auto"/>
+            </w:tcBorders>
+            <w:hideMark/>
+          </w:tcPr>
+          <w:p>
+            <w:pPr>
+              <w:spacing w:after="200" w:line="276" w:lineRule="auto"/>
+              <w:rPr>
+                <w:rFonts w:ascii="Arial" w:hAnsi="Arial" w:cs="Arial"/>
+              </w:rPr>
+            </w:pPr>
+            <w:r>
+              <w:rPr>
+                <w:rFonts w:ascii="Arial" w:hAnsi="Arial" w:cs="Arial"/>
+              </w:rPr>
+              <w:t>Un membro del team non presente, abbiamo accelerato nello sviluppo per recuperare la mancanza.</w:t>
+            </w:r>
+          </w:p>
+        </w:tc>
+      </w:tr>
+    </w:tbl>
+    <w:p>
+      <w:pPr>
+        <w:rPr>
+          <w:rFonts w:ascii="Arial" w:hAnsi="Arial" w:cs="Arial"/>
+        </w:rPr>
+      </w:pPr>
+    </w:p>
+    <w:tbl>
+      <w:tblPr>
+        <w:tblStyle w:val="Grigliatabella"/>
+        <w:tblW w:w="0" w:type="auto"/>
+        <w:tblLook w:val="04A0" w:firstRow="1" w:lastRow="0" w:firstColumn="1" w:lastColumn="0" w:noHBand="0" w:noVBand="1"/>
+      </w:tblPr>
+      <w:tblGrid>
+        <w:gridCol w:w="9628"/>
+      </w:tblGrid>
+      <w:tr>
+        <w:tc>
+          <w:tcPr>
+            <w:tcW w:w="9854" w:type="dxa"/>
+            <w:tcBorders>
+              <w:top w:val="single" w:sz="4" w:space="0" w:color="auto"/>
+              <w:left w:val="single" w:sz="4" w:space="0" w:color="auto"/>
+              <w:bottom w:val="single" w:sz="4" w:space="0" w:color="auto"/>
+              <w:right w:val="single" w:sz="4" w:space="0" w:color="auto"/>
+            </w:tcBorders>
+            <w:shd w:val="clear" w:color="auto" w:fill="D9D9D9" w:themeFill="background1" w:themeFillShade="D9"/>
+            <w:hideMark/>
+          </w:tcPr>
+          <w:p>
+            <w:pPr>
+              <w:spacing w:after="200" w:line="276" w:lineRule="auto"/>
+              <w:rPr>
+                <w:rFonts w:ascii="Arial" w:hAnsi="Arial" w:cs="Arial"/>
+              </w:rPr>
+            </w:pPr>
+            <w:r>
+              <w:rPr>
+                <w:rFonts w:ascii="Arial" w:hAnsi="Arial" w:cs="Arial"/>
+              </w:rPr>
+              <w:t>Punto della situazione rispetto alla pianificazione</w:t>
+            </w:r>
+          </w:p>
+        </w:tc>
+      </w:tr>
+      <w:tr>
+        <w:tc>
+          <w:tcPr>
+            <w:tcW w:w="9854" w:type="dxa"/>
+            <w:tcBorders>
+              <w:top w:val="single" w:sz="4" w:space="0" w:color="auto"/>
+              <w:left w:val="single" w:sz="4" w:space="0" w:color="auto"/>
+              <w:bottom w:val="single" w:sz="4" w:space="0" w:color="auto"/>
+              <w:right w:val="single" w:sz="4" w:space="0" w:color="auto"/>
+            </w:tcBorders>
+            <w:hideMark/>
+          </w:tcPr>
+          <w:p>
+            <w:pPr>
+              <w:spacing w:after="200" w:line="276" w:lineRule="auto"/>
+              <w:rPr>
+                <w:rFonts w:ascii="Arial" w:hAnsi="Arial" w:cs="Arial"/>
+              </w:rPr>
+            </w:pPr>
+          </w:p>
+        </w:tc>
+      </w:tr>
+    </w:tbl>
+    <w:p>
+      <w:pPr>
+        <w:rPr>
+          <w:rFonts w:ascii="Arial" w:hAnsi="Arial" w:cs="Arial"/>
+        </w:rPr>
+      </w:pPr>
+    </w:p>
+    <w:tbl>
+      <w:tblPr>
+        <w:tblStyle w:val="Grigliatabella"/>
+        <w:tblW w:w="0" w:type="auto"/>
+        <w:tblLook w:val="04A0" w:firstRow="1" w:lastRow="0" w:firstColumn="1" w:lastColumn="0" w:noHBand="0" w:noVBand="1"/>
+      </w:tblPr>
+      <w:tblGrid>
+        <w:gridCol w:w="9628"/>
+      </w:tblGrid>
+      <w:tr>
+        <w:tc>
+          <w:tcPr>
+            <w:tcW w:w="9854" w:type="dxa"/>
+            <w:tcBorders>
+              <w:top w:val="single" w:sz="4" w:space="0" w:color="auto"/>
+              <w:left w:val="single" w:sz="4" w:space="0" w:color="auto"/>
+              <w:bottom w:val="single" w:sz="4" w:space="0" w:color="auto"/>
+              <w:right w:val="single" w:sz="4" w:space="0" w:color="auto"/>
+            </w:tcBorders>
+            <w:shd w:val="clear" w:color="auto" w:fill="D9D9D9" w:themeFill="background1" w:themeFillShade="D9"/>
+            <w:hideMark/>
+          </w:tcPr>
+          <w:p>
+            <w:pPr>
+              <w:spacing w:after="200" w:line="276" w:lineRule="auto"/>
+              <w:rPr>
+                <w:rFonts w:ascii="Arial" w:hAnsi="Arial" w:cs="Arial"/>
+              </w:rPr>
+            </w:pPr>
+            <w:r>
+              <w:rPr>
+                <w:rFonts w:ascii="Arial" w:hAnsi="Arial" w:cs="Arial"/>
+              </w:rPr>
+              <w:t>Programma di massima per la prossima giornata di lavoro</w:t>
+            </w:r>
+          </w:p>
+        </w:tc>
+      </w:tr>
+      <w:tr>
+        <w:tc>
+          <w:tcPr>
+            <w:tcW w:w="9854" w:type="dxa"/>
+            <w:tcBorders>
+              <w:top w:val="single" w:sz="4" w:space="0" w:color="auto"/>
+              <w:left w:val="single" w:sz="4" w:space="0" w:color="auto"/>
+              <w:bottom w:val="single" w:sz="4" w:space="0" w:color="auto"/>
+              <w:right w:val="single" w:sz="4" w:space="0" w:color="auto"/>
+            </w:tcBorders>
+            <w:hideMark/>
+          </w:tcPr>
+          <w:p>
+            <w:pPr>
+              <w:spacing w:after="200" w:line="276" w:lineRule="auto"/>
+              <w:rPr>
+                <w:rFonts w:ascii="Arial" w:hAnsi="Arial" w:cs="Arial"/>
+              </w:rPr>
+            </w:pPr>
+          </w:p>
+        </w:tc>
+      </w:tr>
+    </w:tbl>
+    <w:p>
+      <w:pPr>
+        <w:rPr>
+          <w:rFonts w:ascii="Arial" w:hAnsi="Arial" w:cs="Arial"/>
+        </w:rPr>
+      </w:pPr>
+    </w:p>
+    <w:p>
+      <w:pPr>
+        <w:pStyle w:val="Titolo2"/>
+        <w:rPr>
+          <w:sz w:val="36"/>
+        </w:rPr>
+      </w:pPr>
+      <w:r>
+        <w:rPr>
+          <w:sz w:val="36"/>
+        </w:rPr>
+        <w:t>Agile</w:t>
+      </w:r>
+      <w:r>
+        <w:rPr>
+          <w:sz w:val="36"/>
+        </w:rPr>
+        <w:t xml:space="preserve"> - Resoconto</w:t>
+      </w:r>
+    </w:p>
+    <w:tbl>
+      <w:tblPr>
+        <w:tblStyle w:val="Grigliatabella"/>
+        <w:tblW w:w="0" w:type="auto"/>
+        <w:tblLook w:val="04A0" w:firstRow="1" w:lastRow="0" w:firstColumn="1" w:lastColumn="0" w:noHBand="0" w:noVBand="1"/>
+      </w:tblPr>
+      <w:tblGrid>
+        <w:gridCol w:w="9628"/>
+      </w:tblGrid>
+      <w:tr>
+        <w:tc>
+          <w:tcPr>
+            <w:tcW w:w="9854" w:type="dxa"/>
+            <w:shd w:val="clear" w:color="auto" w:fill="D9D9D9" w:themeFill="background1" w:themeFillShade="D9"/>
+          </w:tcPr>
+          <w:p>
+            <w:pPr>
+              <w:rPr>
+                <w:rFonts w:ascii="Arial" w:hAnsi="Arial" w:cs="Arial"/>
+              </w:rPr>
+            </w:pPr>
+            <w:r>
+              <w:rPr>
+                <w:rFonts w:ascii="Arial" w:hAnsi="Arial" w:cs="Arial"/>
+              </w:rPr>
+              <w:t>Daily Scrum</w:t>
+            </w:r>
+          </w:p>
+        </w:tc>
+      </w:tr>
+      <w:tr>
+        <w:tc>
+          <w:tcPr>
+            <w:tcW w:w="9854" w:type="dxa"/>
+          </w:tcPr>
+          <w:p>
+            <w:pPr>
+              <w:rPr>
+                <w:rFonts w:ascii="Arial" w:hAnsi="Arial" w:cs="Arial"/>
+              </w:rPr>
+            </w:pPr>
+            <w:r>
+              <w:rPr>
+                <w:rFonts w:ascii="Arial" w:hAnsi="Arial" w:cs="Arial"/>
+              </w:rPr>
+              <w:t>A causa della mancanza di uno dei 3 membri del team, abbiamo deciso di dividerci gli incarichi in modo tale da compensare la mancanza di mano d’opera.</w:t>
+            </w:r>
+          </w:p>
+        </w:tc>
+      </w:tr>
+    </w:tbl>
+    <w:p>
+      <w:pPr>
+        <w:rPr>
+          <w:rFonts w:ascii="Arial" w:hAnsi="Arial" w:cs="Arial"/>
+        </w:rPr>
+      </w:pPr>
+    </w:p>
+    <w:tbl>
+      <w:tblPr>
+        <w:tblStyle w:val="Grigliatabella"/>
+        <w:tblW w:w="0" w:type="auto"/>
+        <w:tblLook w:val="04A0" w:firstRow="1" w:lastRow="0" w:firstColumn="1" w:lastColumn="0" w:noHBand="0" w:noVBand="1"/>
+      </w:tblPr>
+      <w:tblGrid>
+        <w:gridCol w:w="9628"/>
+      </w:tblGrid>
+      <w:tr>
+        <w:tc>
+          <w:tcPr>
+            <w:tcW w:w="9854" w:type="dxa"/>
+            <w:shd w:val="clear" w:color="auto" w:fill="D9D9D9" w:themeFill="background1" w:themeFillShade="D9"/>
+          </w:tcPr>
+          <w:p>
+            <w:pPr>
+              <w:rPr>
+                <w:rFonts w:ascii="Arial" w:hAnsi="Arial" w:cs="Arial"/>
+              </w:rPr>
+            </w:pPr>
+            <w:r>
+              <w:rPr>
+                <w:rFonts w:ascii="Arial" w:hAnsi="Arial" w:cs="Arial"/>
+              </w:rPr>
+              <w:t>Sprint Planning</w:t>
+            </w:r>
+          </w:p>
+        </w:tc>
+      </w:tr>
+      <w:tr>
+        <w:tc>
+          <w:tcPr>
+            <w:tcW w:w="9854" w:type="dxa"/>
+          </w:tcPr>
+          <w:p>
+            <w:pPr>
+              <w:rPr>
+                <w:rFonts w:ascii="Arial" w:hAnsi="Arial" w:cs="Arial"/>
+              </w:rPr>
+            </w:pPr>
+          </w:p>
+        </w:tc>
+      </w:tr>
+    </w:tbl>
+    <w:p>
+      <w:pPr>
+        <w:rPr>
+          <w:rFonts w:ascii="Arial" w:hAnsi="Arial" w:cs="Arial"/>
+        </w:rPr>
+      </w:pPr>
+    </w:p>
+    <w:tbl>
+      <w:tblPr>
+        <w:tblStyle w:val="Grigliatabella"/>
+        <w:tblW w:w="0" w:type="auto"/>
+        <w:tblLook w:val="04A0" w:firstRow="1" w:lastRow="0" w:firstColumn="1" w:lastColumn="0" w:noHBand="0" w:noVBand="1"/>
+      </w:tblPr>
+      <w:tblGrid>
+        <w:gridCol w:w="9628"/>
+      </w:tblGrid>
+      <w:tr>
+        <w:tc>
+          <w:tcPr>
+            <w:tcW w:w="9854" w:type="dxa"/>
+            <w:shd w:val="clear" w:color="auto" w:fill="D9D9D9" w:themeFill="background1" w:themeFillShade="D9"/>
+          </w:tcPr>
+          <w:p>
+            <w:pPr>
+              <w:rPr>
+                <w:rFonts w:ascii="Arial" w:hAnsi="Arial" w:cs="Arial"/>
+              </w:rPr>
+            </w:pPr>
+            <w:r>
+              <w:rPr>
+                <w:rFonts w:ascii="Arial" w:hAnsi="Arial" w:cs="Arial"/>
+              </w:rPr>
+              <w:t>Sprint Review</w:t>
+            </w:r>
+          </w:p>
+        </w:tc>
+      </w:tr>
+      <w:tr>
+        <w:tc>
+          <w:tcPr>
+            <w:tcW w:w="9854" w:type="dxa"/>
+          </w:tcPr>
+          <w:p>
+            <w:pPr>
+              <w:rPr>
+                <w:rFonts w:ascii="Arial" w:hAnsi="Arial" w:cs="Arial"/>
+              </w:rPr>
+            </w:pPr>
+          </w:p>
+        </w:tc>
+      </w:tr>
+    </w:tbl>
+    <w:p>
+      <w:pPr>
+        <w:rPr>
+          <w:rFonts w:ascii="Arial" w:hAnsi="Arial" w:cs="Arial"/>
+        </w:rPr>
+      </w:pPr>
+    </w:p>
+    <w:tbl>
+      <w:tblPr>
+        <w:tblStyle w:val="Grigliatabella"/>
+        <w:tblW w:w="0" w:type="auto"/>
+        <w:tblLook w:val="04A0" w:firstRow="1" w:lastRow="0" w:firstColumn="1" w:lastColumn="0" w:noHBand="0" w:noVBand="1"/>
+      </w:tblPr>
+      <w:tblGrid>
+        <w:gridCol w:w="9628"/>
+      </w:tblGrid>
+      <w:tr>
+        <w:tc>
+          <w:tcPr>
+            <w:tcW w:w="9854" w:type="dxa"/>
+            <w:shd w:val="clear" w:color="auto" w:fill="D9D9D9" w:themeFill="background1" w:themeFillShade="D9"/>
+          </w:tcPr>
+          <w:p>
+            <w:pPr>
+              <w:rPr>
+                <w:rFonts w:ascii="Arial" w:hAnsi="Arial" w:cs="Arial"/>
+              </w:rPr>
+            </w:pPr>
+            <w:r>
+              <w:rPr>
+                <w:rFonts w:ascii="Arial" w:hAnsi="Arial" w:cs="Arial"/>
+              </w:rPr>
+              <w:t>Sprint Retrospective</w:t>
+            </w:r>
           </w:p>
         </w:tc>
       </w:tr>
@@ -4232,35 +4525,7 @@
           <w:rPr>
             <w:rFonts w:ascii="Arial" w:hAnsi="Arial" w:cs="Arial"/>
           </w:rPr>
-          <w:t xml:space="preserve">System </w:t>
-        </w:r>
-        <w:proofErr w:type="spellStart"/>
-        <w:r>
-          <w:rPr>
-            <w:rFonts w:ascii="Arial" w:hAnsi="Arial" w:cs="Arial"/>
-          </w:rPr>
-          <w:t>Breach</w:t>
-        </w:r>
-        <w:proofErr w:type="spellEnd"/>
-        <w:r>
-          <w:rPr>
-            <w:rFonts w:ascii="Arial" w:hAnsi="Arial" w:cs="Arial"/>
-          </w:rPr>
-          <w:t xml:space="preserve">: </w:t>
-        </w:r>
-        <w:proofErr w:type="spellStart"/>
-        <w:r>
-          <w:rPr>
-            <w:rFonts w:ascii="Arial" w:hAnsi="Arial" w:cs="Arial"/>
-          </w:rPr>
-          <w:t>Five</w:t>
-        </w:r>
-        <w:proofErr w:type="spellEnd"/>
-        <w:r>
-          <w:rPr>
-            <w:rFonts w:ascii="Arial" w:hAnsi="Arial" w:cs="Arial"/>
-          </w:rPr>
-          <w:t xml:space="preserve"> Nights</w:t>
+          <w:t>System Breach: Five Nights</w:t>
         </w:r>
       </w:sdtContent>
     </w:sdt>
@@ -7153,6 +7418,7 @@
   <w:style w:type="character" w:default="1" w:styleId="Carpredefinitoparagrafo">
     <w:name w:val="Default Paragraph Font"/>
     <w:uiPriority w:val="1"/>
+    <w:semiHidden/>
     <w:unhideWhenUsed/>
   </w:style>
   <w:style w:type="table" w:default="1" w:styleId="Tabellanormale">
@@ -7791,8 +8057,10 @@
     <w:rsid w:val="005D407D"/>
     <w:rsid w:val="005F1498"/>
     <w:rsid w:val="006162E1"/>
+    <w:rsid w:val="00634C39"/>
     <w:rsid w:val="0063600C"/>
     <w:rsid w:val="006426E3"/>
+    <w:rsid w:val="00643A93"/>
     <w:rsid w:val="00670B36"/>
     <w:rsid w:val="00671005"/>
     <w:rsid w:val="00673D1E"/>

</xml_diff>

<commit_message>
Fix merge conflict e aggiunta Sprint Planning
</commit_message>
<xml_diff>
--- a/4_Diari/Diario.docx
+++ b/4_Diari/Diario.docx
@@ -1,6 +1,6 @@
 
 <file path=word/document.xml><?xml version="1.0" encoding="utf-8"?>
-<w:document xmlns:wpc="http://schemas.microsoft.com/office/word/2010/wordprocessingCanvas" xmlns:cx="http://schemas.microsoft.com/office/drawing/2014/chartex" xmlns:cx1="http://schemas.microsoft.com/office/drawing/2015/9/8/chartex" xmlns:cx2="http://schemas.microsoft.com/office/drawing/2015/10/21/chartex" xmlns:cx3="http://schemas.microsoft.com/office/drawing/2016/5/9/chartex" xmlns:cx4="http://schemas.microsoft.com/office/drawing/2016/5/10/chartex" xmlns:cx5="http://schemas.microsoft.com/office/drawing/2016/5/11/chartex" xmlns:cx6="http://schemas.microsoft.com/office/drawing/2016/5/12/chartex" xmlns:cx7="http://schemas.microsoft.com/office/drawing/2016/5/13/chartex" xmlns:cx8="http://schemas.microsoft.com/office/drawing/2016/5/14/chartex" xmlns:mc="http://schemas.openxmlformats.org/markup-compatibility/2006" xmlns:aink="http://schemas.microsoft.com/office/drawing/2016/ink" xmlns:am3d="http://schemas.microsoft.com/office/drawing/2017/model3d" xmlns:o="urn:schemas-microsoft-com:office:office" xmlns:oel="http://schemas.microsoft.com/office/2019/extlst" xmlns:r="http://schemas.openxmlformats.org/officeDocument/2006/relationships" xmlns:m="http://schemas.openxmlformats.org/officeDocument/2006/math" xmlns:v="urn:schemas-microsoft-com:vml" xmlns:wp14="http://schemas.microsoft.com/office/word/2010/wordprocessingDrawing" xmlns:wp="http://schemas.openxmlformats.org/drawingml/2006/wordprocessingDrawing" xmlns:w10="urn:schemas-microsoft-com:office:word" xmlns:w="http://schemas.openxmlformats.org/wordprocessingml/2006/main" xmlns:w14="http://schemas.microsoft.com/office/word/2010/wordml" xmlns:w15="http://schemas.microsoft.com/office/word/2012/wordml" xmlns:w16cex="http://schemas.microsoft.com/office/word/2018/wordml/cex" xmlns:w16cid="http://schemas.microsoft.com/office/word/2016/wordml/cid" xmlns:w16="http://schemas.microsoft.com/office/word/2018/wordml" xmlns:w16sdtdh="http://schemas.microsoft.com/office/word/2020/wordml/sdtdatahash" xmlns:w16se="http://schemas.microsoft.com/office/word/2015/wordml/symex" xmlns:wpg="http://schemas.microsoft.com/office/word/2010/wordprocessingGroup" xmlns:wpi="http://schemas.microsoft.com/office/word/2010/wordprocessingInk" xmlns:wne="http://schemas.microsoft.com/office/word/2006/wordml" xmlns:wps="http://schemas.microsoft.com/office/word/2010/wordprocessingShape" mc:Ignorable="w14 w15 w16se w16cid w16 w16cex w16sdtdh wp14">
+<w:document xmlns:wpc="http://schemas.microsoft.com/office/word/2010/wordprocessingCanvas" xmlns:cx="http://schemas.microsoft.com/office/drawing/2014/chartex" xmlns:cx1="http://schemas.microsoft.com/office/drawing/2015/9/8/chartex" xmlns:cx2="http://schemas.microsoft.com/office/drawing/2015/10/21/chartex" xmlns:cx3="http://schemas.microsoft.com/office/drawing/2016/5/9/chartex" xmlns:cx4="http://schemas.microsoft.com/office/drawing/2016/5/10/chartex" xmlns:cx5="http://schemas.microsoft.com/office/drawing/2016/5/11/chartex" xmlns:cx6="http://schemas.microsoft.com/office/drawing/2016/5/12/chartex" xmlns:cx7="http://schemas.microsoft.com/office/drawing/2016/5/13/chartex" xmlns:cx8="http://schemas.microsoft.com/office/drawing/2016/5/14/chartex" xmlns:mc="http://schemas.openxmlformats.org/markup-compatibility/2006" xmlns:aink="http://schemas.microsoft.com/office/drawing/2016/ink" xmlns:am3d="http://schemas.microsoft.com/office/drawing/2017/model3d" xmlns:o="urn:schemas-microsoft-com:office:office" xmlns:oel="http://schemas.microsoft.com/office/2019/extlst" xmlns:r="http://schemas.openxmlformats.org/officeDocument/2006/relationships" xmlns:m="http://schemas.openxmlformats.org/officeDocument/2006/math" xmlns:v="urn:schemas-microsoft-com:vml" xmlns:wp14="http://schemas.microsoft.com/office/word/2010/wordprocessingDrawing" xmlns:wp="http://schemas.openxmlformats.org/drawingml/2006/wordprocessingDrawing" xmlns:w10="urn:schemas-microsoft-com:office:word" xmlns:w="http://schemas.openxmlformats.org/wordprocessingml/2006/main" xmlns:w14="http://schemas.microsoft.com/office/word/2010/wordml" xmlns:w15="http://schemas.microsoft.com/office/word/2012/wordml" xmlns:w16cex="http://schemas.microsoft.com/office/word/2018/wordml/cex" xmlns:w16cid="http://schemas.microsoft.com/office/word/2016/wordml/cid" xmlns:w16="http://schemas.microsoft.com/office/word/2018/wordml" xmlns:w16du="http://schemas.microsoft.com/office/word/2023/wordml/word16du" xmlns:w16sdtdh="http://schemas.microsoft.com/office/word/2020/wordml/sdtdatahash" xmlns:w16sdtfl="http://schemas.microsoft.com/office/word/2024/wordml/sdtformatlock" xmlns:w16se="http://schemas.microsoft.com/office/word/2015/wordml/symex" xmlns:wpg="http://schemas.microsoft.com/office/word/2010/wordprocessingGroup" xmlns:wpi="http://schemas.microsoft.com/office/word/2010/wordprocessingInk" xmlns:wne="http://schemas.microsoft.com/office/word/2006/wordml" xmlns:wps="http://schemas.microsoft.com/office/word/2010/wordprocessingShape" mc:Ignorable="w14 w15 w16se w16cid w16 w16cex w16sdtdh w16sdtfl w16du wp14">
   <w:body>
     <w:p>
       <w:pPr>
@@ -732,7 +732,21 @@
               <w:rPr>
                 <w:rFonts w:ascii="Arial" w:hAnsi="Arial" w:cs="Arial"/>
               </w:rPr>
-              <w:t>Finire lo use case e fare un activity diagram. Inizio pianificazione.</w:t>
+              <w:t xml:space="preserve">Finire lo use case e fare un activity </w:t>
+            </w:r>
+            <w:proofErr w:type="spellStart"/>
+            <w:r>
+              <w:rPr>
+                <w:rFonts w:ascii="Arial" w:hAnsi="Arial" w:cs="Arial"/>
+              </w:rPr>
+              <w:t>diagram</w:t>
+            </w:r>
+            <w:proofErr w:type="spellEnd"/>
+            <w:r>
+              <w:rPr>
+                <w:rFonts w:ascii="Arial" w:hAnsi="Arial" w:cs="Arial"/>
+              </w:rPr>
+              <w:t>. Inizio pianificazione.</w:t>
             </w:r>
           </w:p>
         </w:tc>
@@ -922,7 +936,19 @@
               <w:rPr>
                 <w:rFonts w:ascii="Arial" w:hAnsi="Arial" w:cs="Arial"/>
               </w:rPr>
-              <w:t xml:space="preserve"> gli use case per la logica del nostro gioco</w:t>
+              <w:t xml:space="preserve"> </w:t>
+            </w:r>
+            <w:r>
+              <w:rPr>
+                <w:rFonts w:ascii="Arial" w:hAnsi="Arial" w:cs="Arial"/>
+              </w:rPr>
+              <w:t>le use</w:t>
+            </w:r>
+            <w:r>
+              <w:rPr>
+                <w:rFonts w:ascii="Arial" w:hAnsi="Arial" w:cs="Arial"/>
+              </w:rPr>
+              <w:t xml:space="preserve"> case per la logica del nostro gioco</w:t>
             </w:r>
             <w:r>
               <w:rPr>
@@ -971,7 +997,21 @@
               <w:rPr>
                 <w:rFonts w:ascii="Arial" w:hAnsi="Arial" w:cs="Arial"/>
               </w:rPr>
-              <w:t xml:space="preserve"> a creare la grafica e la storia del nostro gioco e iniziato a fare i mockup.</w:t>
+              <w:t xml:space="preserve"> a creare la grafica e la storia del nostro gioco e iniziato a fare i </w:t>
+            </w:r>
+            <w:proofErr w:type="spellStart"/>
+            <w:r>
+              <w:rPr>
+                <w:rFonts w:ascii="Arial" w:hAnsi="Arial" w:cs="Arial"/>
+              </w:rPr>
+              <w:t>mockup</w:t>
+            </w:r>
+            <w:proofErr w:type="spellEnd"/>
+            <w:r>
+              <w:rPr>
+                <w:rFonts w:ascii="Arial" w:hAnsi="Arial" w:cs="Arial"/>
+              </w:rPr>
+              <w:t>.</w:t>
             </w:r>
           </w:p>
         </w:tc>
@@ -1170,8 +1210,30 @@
               <w:rPr>
                 <w:rFonts w:ascii="Arial" w:hAnsi="Arial" w:cs="Arial"/>
               </w:rPr>
-              <w:t>, continuo mockup e grafica, sviluppo Activity Diagram</w:t>
-            </w:r>
+              <w:t xml:space="preserve">, continuo </w:t>
+            </w:r>
+            <w:proofErr w:type="spellStart"/>
+            <w:r>
+              <w:rPr>
+                <w:rFonts w:ascii="Arial" w:hAnsi="Arial" w:cs="Arial"/>
+              </w:rPr>
+              <w:t>mockup</w:t>
+            </w:r>
+            <w:proofErr w:type="spellEnd"/>
+            <w:r>
+              <w:rPr>
+                <w:rFonts w:ascii="Arial" w:hAnsi="Arial" w:cs="Arial"/>
+              </w:rPr>
+              <w:t xml:space="preserve"> e grafica, sviluppo Activity </w:t>
+            </w:r>
+            <w:proofErr w:type="spellStart"/>
+            <w:r>
+              <w:rPr>
+                <w:rFonts w:ascii="Arial" w:hAnsi="Arial" w:cs="Arial"/>
+              </w:rPr>
+              <w:t>Diagram</w:t>
+            </w:r>
+            <w:proofErr w:type="spellEnd"/>
             <w:r>
               <w:rPr>
                 <w:rFonts w:ascii="Arial" w:hAnsi="Arial" w:cs="Arial"/>
@@ -1399,7 +1461,47 @@
               <w:rPr>
                 <w:rFonts w:ascii="Arial" w:hAnsi="Arial" w:cs="Arial"/>
               </w:rPr>
-              <w:t>Abbiamo completato la fase di ricerca, definendo lo use case e i relativi swimlane diagram. La documentazione è stata integrata con l’analisi del dominio, lo scopo del progetto e le descrizioni dettagliate dei processi. Infine, abbiamo redatto e incluso il diagramma di Gantt preventivo.</w:t>
+              <w:t xml:space="preserve">Abbiamo completato la fase di ricerca, definendo </w:t>
+            </w:r>
+            <w:r>
+              <w:rPr>
+                <w:rFonts w:ascii="Arial" w:hAnsi="Arial" w:cs="Arial"/>
+              </w:rPr>
+              <w:t>le use</w:t>
+            </w:r>
+            <w:r>
+              <w:rPr>
+                <w:rFonts w:ascii="Arial" w:hAnsi="Arial" w:cs="Arial"/>
+              </w:rPr>
+              <w:t xml:space="preserve"> case e i relativi </w:t>
+            </w:r>
+            <w:proofErr w:type="spellStart"/>
+            <w:r>
+              <w:rPr>
+                <w:rFonts w:ascii="Arial" w:hAnsi="Arial" w:cs="Arial"/>
+              </w:rPr>
+              <w:t>swimlane</w:t>
+            </w:r>
+            <w:proofErr w:type="spellEnd"/>
+            <w:r>
+              <w:rPr>
+                <w:rFonts w:ascii="Arial" w:hAnsi="Arial" w:cs="Arial"/>
+              </w:rPr>
+              <w:t xml:space="preserve"> </w:t>
+            </w:r>
+            <w:proofErr w:type="spellStart"/>
+            <w:r>
+              <w:rPr>
+                <w:rFonts w:ascii="Arial" w:hAnsi="Arial" w:cs="Arial"/>
+              </w:rPr>
+              <w:t>diagram</w:t>
+            </w:r>
+            <w:proofErr w:type="spellEnd"/>
+            <w:r>
+              <w:rPr>
+                <w:rFonts w:ascii="Arial" w:hAnsi="Arial" w:cs="Arial"/>
+              </w:rPr>
+              <w:t>. La documentazione è stata integrata con l’analisi del dominio, lo scopo del progetto e le descrizioni dettagliate dei processi. Infine, abbiamo redatto e incluso il diagramma di Gantt preventivo.</w:t>
             </w:r>
             <w:r>
               <w:rPr>
@@ -1859,7 +1961,35 @@
                 <w:rFonts w:ascii="Arial" w:hAnsi="Arial" w:cs="Arial"/>
               </w:rPr>
               <w:br/>
-              <w:t>Abbiamo fatto ricerche su come cambiare impostazioni specifiche in GameMaker, su funzionamenti avanzati di git per evitare conflitti.</w:t>
+              <w:t xml:space="preserve">Abbiamo fatto ricerche su come cambiare impostazioni specifiche in </w:t>
+            </w:r>
+            <w:proofErr w:type="spellStart"/>
+            <w:r>
+              <w:rPr>
+                <w:rFonts w:ascii="Arial" w:hAnsi="Arial" w:cs="Arial"/>
+              </w:rPr>
+              <w:t>GameMaker</w:t>
+            </w:r>
+            <w:proofErr w:type="spellEnd"/>
+            <w:r>
+              <w:rPr>
+                <w:rFonts w:ascii="Arial" w:hAnsi="Arial" w:cs="Arial"/>
+              </w:rPr>
+              <w:t xml:space="preserve">, su funzionamenti avanzati di </w:t>
+            </w:r>
+            <w:proofErr w:type="spellStart"/>
+            <w:r>
+              <w:rPr>
+                <w:rFonts w:ascii="Arial" w:hAnsi="Arial" w:cs="Arial"/>
+              </w:rPr>
+              <w:t>git</w:t>
+            </w:r>
+            <w:proofErr w:type="spellEnd"/>
+            <w:r>
+              <w:rPr>
+                <w:rFonts w:ascii="Arial" w:hAnsi="Arial" w:cs="Arial"/>
+              </w:rPr>
+              <w:t xml:space="preserve"> per evitare conflitti.</w:t>
             </w:r>
             <w:r>
               <w:rPr>
@@ -1954,7 +2084,49 @@
               <w:rPr>
                 <w:rFonts w:ascii="Arial" w:hAnsi="Arial" w:cs="Arial"/>
               </w:rPr>
-              <w:t>Problemi con l’organizzazione delle versioni su github, ci sono stati dei file che in alcune situazioni venivano modificati da più persone, e questo provocava problemi di merging da parte di GitHub. Per risolvere abbiamo dovuto riprendere un push vecchio ed allinearci tutti ad esso, per evitare il più possibile i conflitti.</w:t>
+              <w:t xml:space="preserve">Problemi con l’organizzazione delle versioni su </w:t>
+            </w:r>
+            <w:proofErr w:type="spellStart"/>
+            <w:r>
+              <w:rPr>
+                <w:rFonts w:ascii="Arial" w:hAnsi="Arial" w:cs="Arial"/>
+              </w:rPr>
+              <w:t>github</w:t>
+            </w:r>
+            <w:proofErr w:type="spellEnd"/>
+            <w:r>
+              <w:rPr>
+                <w:rFonts w:ascii="Arial" w:hAnsi="Arial" w:cs="Arial"/>
+              </w:rPr>
+              <w:t xml:space="preserve">, ci sono stati dei file che in alcune situazioni venivano modificati da più persone, e questo provocava problemi di </w:t>
+            </w:r>
+            <w:proofErr w:type="spellStart"/>
+            <w:r>
+              <w:rPr>
+                <w:rFonts w:ascii="Arial" w:hAnsi="Arial" w:cs="Arial"/>
+              </w:rPr>
+              <w:t>merging</w:t>
+            </w:r>
+            <w:proofErr w:type="spellEnd"/>
+            <w:r>
+              <w:rPr>
+                <w:rFonts w:ascii="Arial" w:hAnsi="Arial" w:cs="Arial"/>
+              </w:rPr>
+              <w:t xml:space="preserve"> da parte di GitHub. Per risolvere abbiamo dovuto riprendere un </w:t>
+            </w:r>
+            <w:proofErr w:type="spellStart"/>
+            <w:r>
+              <w:rPr>
+                <w:rFonts w:ascii="Arial" w:hAnsi="Arial" w:cs="Arial"/>
+              </w:rPr>
+              <w:t>push</w:t>
+            </w:r>
+            <w:proofErr w:type="spellEnd"/>
+            <w:r>
+              <w:rPr>
+                <w:rFonts w:ascii="Arial" w:hAnsi="Arial" w:cs="Arial"/>
+              </w:rPr>
+              <w:t xml:space="preserve"> vecchio ed allinearci tutti ad esso, per evitare il più possibile i conflitti.</w:t>
             </w:r>
           </w:p>
         </w:tc>
@@ -2161,8 +2333,16 @@
               <w:rPr>
                 <w:rFonts w:ascii="Arial" w:hAnsi="Arial" w:cs="Arial"/>
               </w:rPr>
-              <w:t>Daily Scrum</w:t>
-            </w:r>
+              <w:t xml:space="preserve">Daily </w:t>
+            </w:r>
+            <w:proofErr w:type="spellStart"/>
+            <w:r>
+              <w:rPr>
+                <w:rFonts w:ascii="Arial" w:hAnsi="Arial" w:cs="Arial"/>
+              </w:rPr>
+              <w:t>Scrum</w:t>
+            </w:r>
+            <w:proofErr w:type="spellEnd"/>
           </w:p>
         </w:tc>
       </w:tr>
@@ -2330,8 +2510,16 @@
               <w:rPr>
                 <w:rFonts w:ascii="Arial" w:hAnsi="Arial" w:cs="Arial"/>
               </w:rPr>
-              <w:t>Sprint Retrospective</w:t>
-            </w:r>
+              <w:t xml:space="preserve">Sprint </w:t>
+            </w:r>
+            <w:proofErr w:type="spellStart"/>
+            <w:r>
+              <w:rPr>
+                <w:rFonts w:ascii="Arial" w:hAnsi="Arial" w:cs="Arial"/>
+              </w:rPr>
+              <w:t>Retrospective</w:t>
+            </w:r>
+            <w:proofErr w:type="spellEnd"/>
           </w:p>
         </w:tc>
       </w:tr>
@@ -2370,7 +2558,7 @@
 </file>
 
 <file path=word/endnotes.xml><?xml version="1.0" encoding="utf-8"?>
-<w:endnotes xmlns:wpc="http://schemas.microsoft.com/office/word/2010/wordprocessingCanvas" xmlns:cx="http://schemas.microsoft.com/office/drawing/2014/chartex" xmlns:cx1="http://schemas.microsoft.com/office/drawing/2015/9/8/chartex" xmlns:cx2="http://schemas.microsoft.com/office/drawing/2015/10/21/chartex" xmlns:cx3="http://schemas.microsoft.com/office/drawing/2016/5/9/chartex" xmlns:cx4="http://schemas.microsoft.com/office/drawing/2016/5/10/chartex" xmlns:cx5="http://schemas.microsoft.com/office/drawing/2016/5/11/chartex" xmlns:cx6="http://schemas.microsoft.com/office/drawing/2016/5/12/chartex" xmlns:cx7="http://schemas.microsoft.com/office/drawing/2016/5/13/chartex" xmlns:cx8="http://schemas.microsoft.com/office/drawing/2016/5/14/chartex" xmlns:mc="http://schemas.openxmlformats.org/markup-compatibility/2006" xmlns:aink="http://schemas.microsoft.com/office/drawing/2016/ink" xmlns:am3d="http://schemas.microsoft.com/office/drawing/2017/model3d" xmlns:o="urn:schemas-microsoft-com:office:office" xmlns:oel="http://schemas.microsoft.com/office/2019/extlst" xmlns:r="http://schemas.openxmlformats.org/officeDocument/2006/relationships" xmlns:m="http://schemas.openxmlformats.org/officeDocument/2006/math" xmlns:v="urn:schemas-microsoft-com:vml" xmlns:wp14="http://schemas.microsoft.com/office/word/2010/wordprocessingDrawing" xmlns:wp="http://schemas.openxmlformats.org/drawingml/2006/wordprocessingDrawing" xmlns:w10="urn:schemas-microsoft-com:office:word" xmlns:w="http://schemas.openxmlformats.org/wordprocessingml/2006/main" xmlns:w14="http://schemas.microsoft.com/office/word/2010/wordml" xmlns:w15="http://schemas.microsoft.com/office/word/2012/wordml" xmlns:w16cex="http://schemas.microsoft.com/office/word/2018/wordml/cex" xmlns:w16cid="http://schemas.microsoft.com/office/word/2016/wordml/cid" xmlns:w16="http://schemas.microsoft.com/office/word/2018/wordml" xmlns:w16sdtdh="http://schemas.microsoft.com/office/word/2020/wordml/sdtdatahash" xmlns:w16se="http://schemas.microsoft.com/office/word/2015/wordml/symex" xmlns:wpg="http://schemas.microsoft.com/office/word/2010/wordprocessingGroup" xmlns:wpi="http://schemas.microsoft.com/office/word/2010/wordprocessingInk" xmlns:wne="http://schemas.microsoft.com/office/word/2006/wordml" xmlns:wps="http://schemas.microsoft.com/office/word/2010/wordprocessingShape" mc:Ignorable="w14 w15 w16se w16cid w16 w16cex w16sdtdh wp14">
+<w:endnotes xmlns:wpc="http://schemas.microsoft.com/office/word/2010/wordprocessingCanvas" xmlns:cx="http://schemas.microsoft.com/office/drawing/2014/chartex" xmlns:cx1="http://schemas.microsoft.com/office/drawing/2015/9/8/chartex" xmlns:cx2="http://schemas.microsoft.com/office/drawing/2015/10/21/chartex" xmlns:cx3="http://schemas.microsoft.com/office/drawing/2016/5/9/chartex" xmlns:cx4="http://schemas.microsoft.com/office/drawing/2016/5/10/chartex" xmlns:cx5="http://schemas.microsoft.com/office/drawing/2016/5/11/chartex" xmlns:cx6="http://schemas.microsoft.com/office/drawing/2016/5/12/chartex" xmlns:cx7="http://schemas.microsoft.com/office/drawing/2016/5/13/chartex" xmlns:cx8="http://schemas.microsoft.com/office/drawing/2016/5/14/chartex" xmlns:mc="http://schemas.openxmlformats.org/markup-compatibility/2006" xmlns:aink="http://schemas.microsoft.com/office/drawing/2016/ink" xmlns:am3d="http://schemas.microsoft.com/office/drawing/2017/model3d" xmlns:o="urn:schemas-microsoft-com:office:office" xmlns:oel="http://schemas.microsoft.com/office/2019/extlst" xmlns:r="http://schemas.openxmlformats.org/officeDocument/2006/relationships" xmlns:m="http://schemas.openxmlformats.org/officeDocument/2006/math" xmlns:v="urn:schemas-microsoft-com:vml" xmlns:wp14="http://schemas.microsoft.com/office/word/2010/wordprocessingDrawing" xmlns:wp="http://schemas.openxmlformats.org/drawingml/2006/wordprocessingDrawing" xmlns:w10="urn:schemas-microsoft-com:office:word" xmlns:w="http://schemas.openxmlformats.org/wordprocessingml/2006/main" xmlns:w14="http://schemas.microsoft.com/office/word/2010/wordml" xmlns:w15="http://schemas.microsoft.com/office/word/2012/wordml" xmlns:w16cex="http://schemas.microsoft.com/office/word/2018/wordml/cex" xmlns:w16cid="http://schemas.microsoft.com/office/word/2016/wordml/cid" xmlns:w16="http://schemas.microsoft.com/office/word/2018/wordml" xmlns:w16du="http://schemas.microsoft.com/office/word/2023/wordml/word16du" xmlns:w16sdtdh="http://schemas.microsoft.com/office/word/2020/wordml/sdtdatahash" xmlns:w16sdtfl="http://schemas.microsoft.com/office/word/2024/wordml/sdtformatlock" xmlns:w16se="http://schemas.microsoft.com/office/word/2015/wordml/symex" xmlns:wpg="http://schemas.microsoft.com/office/word/2010/wordprocessingGroup" xmlns:wpi="http://schemas.microsoft.com/office/word/2010/wordprocessingInk" xmlns:wne="http://schemas.microsoft.com/office/word/2006/wordml" xmlns:wps="http://schemas.microsoft.com/office/word/2010/wordprocessingShape" mc:Ignorable="w14 w15 w16se w16cid w16 w16cex w16sdtdh w16sdtfl w16du wp14">
   <w:endnote w:type="separator" w:id="-1">
     <w:p>
       <w:pPr>
@@ -2395,7 +2583,7 @@
 </file>
 
 <file path=word/footer1.xml><?xml version="1.0" encoding="utf-8"?>
-<w:ftr xmlns:wpc="http://schemas.microsoft.com/office/word/2010/wordprocessingCanvas" xmlns:cx="http://schemas.microsoft.com/office/drawing/2014/chartex" xmlns:cx1="http://schemas.microsoft.com/office/drawing/2015/9/8/chartex" xmlns:cx2="http://schemas.microsoft.com/office/drawing/2015/10/21/chartex" xmlns:cx3="http://schemas.microsoft.com/office/drawing/2016/5/9/chartex" xmlns:cx4="http://schemas.microsoft.com/office/drawing/2016/5/10/chartex" xmlns:cx5="http://schemas.microsoft.com/office/drawing/2016/5/11/chartex" xmlns:cx6="http://schemas.microsoft.com/office/drawing/2016/5/12/chartex" xmlns:cx7="http://schemas.microsoft.com/office/drawing/2016/5/13/chartex" xmlns:cx8="http://schemas.microsoft.com/office/drawing/2016/5/14/chartex" xmlns:mc="http://schemas.openxmlformats.org/markup-compatibility/2006" xmlns:aink="http://schemas.microsoft.com/office/drawing/2016/ink" xmlns:am3d="http://schemas.microsoft.com/office/drawing/2017/model3d" xmlns:o="urn:schemas-microsoft-com:office:office" xmlns:oel="http://schemas.microsoft.com/office/2019/extlst" xmlns:r="http://schemas.openxmlformats.org/officeDocument/2006/relationships" xmlns:m="http://schemas.openxmlformats.org/officeDocument/2006/math" xmlns:v="urn:schemas-microsoft-com:vml" xmlns:wp14="http://schemas.microsoft.com/office/word/2010/wordprocessingDrawing" xmlns:wp="http://schemas.openxmlformats.org/drawingml/2006/wordprocessingDrawing" xmlns:w10="urn:schemas-microsoft-com:office:word" xmlns:w="http://schemas.openxmlformats.org/wordprocessingml/2006/main" xmlns:w14="http://schemas.microsoft.com/office/word/2010/wordml" xmlns:w15="http://schemas.microsoft.com/office/word/2012/wordml" xmlns:w16cex="http://schemas.microsoft.com/office/word/2018/wordml/cex" xmlns:w16cid="http://schemas.microsoft.com/office/word/2016/wordml/cid" xmlns:w16="http://schemas.microsoft.com/office/word/2018/wordml" xmlns:w16sdtdh="http://schemas.microsoft.com/office/word/2020/wordml/sdtdatahash" xmlns:w16se="http://schemas.microsoft.com/office/word/2015/wordml/symex" xmlns:wpg="http://schemas.microsoft.com/office/word/2010/wordprocessingGroup" xmlns:wpi="http://schemas.microsoft.com/office/word/2010/wordprocessingInk" xmlns:wne="http://schemas.microsoft.com/office/word/2006/wordml" xmlns:wps="http://schemas.microsoft.com/office/word/2010/wordprocessingShape" mc:Ignorable="w14 w15 w16se w16cid w16 w16cex w16sdtdh wp14">
+<w:ftr xmlns:wpc="http://schemas.microsoft.com/office/word/2010/wordprocessingCanvas" xmlns:cx="http://schemas.microsoft.com/office/drawing/2014/chartex" xmlns:cx1="http://schemas.microsoft.com/office/drawing/2015/9/8/chartex" xmlns:cx2="http://schemas.microsoft.com/office/drawing/2015/10/21/chartex" xmlns:cx3="http://schemas.microsoft.com/office/drawing/2016/5/9/chartex" xmlns:cx4="http://schemas.microsoft.com/office/drawing/2016/5/10/chartex" xmlns:cx5="http://schemas.microsoft.com/office/drawing/2016/5/11/chartex" xmlns:cx6="http://schemas.microsoft.com/office/drawing/2016/5/12/chartex" xmlns:cx7="http://schemas.microsoft.com/office/drawing/2016/5/13/chartex" xmlns:cx8="http://schemas.microsoft.com/office/drawing/2016/5/14/chartex" xmlns:mc="http://schemas.openxmlformats.org/markup-compatibility/2006" xmlns:aink="http://schemas.microsoft.com/office/drawing/2016/ink" xmlns:am3d="http://schemas.microsoft.com/office/drawing/2017/model3d" xmlns:o="urn:schemas-microsoft-com:office:office" xmlns:oel="http://schemas.microsoft.com/office/2019/extlst" xmlns:r="http://schemas.openxmlformats.org/officeDocument/2006/relationships" xmlns:m="http://schemas.openxmlformats.org/officeDocument/2006/math" xmlns:v="urn:schemas-microsoft-com:vml" xmlns:wp14="http://schemas.microsoft.com/office/word/2010/wordprocessingDrawing" xmlns:wp="http://schemas.openxmlformats.org/drawingml/2006/wordprocessingDrawing" xmlns:w10="urn:schemas-microsoft-com:office:word" xmlns:w="http://schemas.openxmlformats.org/wordprocessingml/2006/main" xmlns:w14="http://schemas.microsoft.com/office/word/2010/wordml" xmlns:w15="http://schemas.microsoft.com/office/word/2012/wordml" xmlns:w16cex="http://schemas.microsoft.com/office/word/2018/wordml/cex" xmlns:w16cid="http://schemas.microsoft.com/office/word/2016/wordml/cid" xmlns:w16="http://schemas.microsoft.com/office/word/2018/wordml" xmlns:w16du="http://schemas.microsoft.com/office/word/2023/wordml/word16du" xmlns:w16sdtdh="http://schemas.microsoft.com/office/word/2020/wordml/sdtdatahash" xmlns:w16sdtfl="http://schemas.microsoft.com/office/word/2024/wordml/sdtformatlock" xmlns:w16se="http://schemas.microsoft.com/office/word/2015/wordml/symex" xmlns:wpg="http://schemas.microsoft.com/office/word/2010/wordprocessingGroup" xmlns:wpi="http://schemas.microsoft.com/office/word/2010/wordprocessingInk" xmlns:wne="http://schemas.microsoft.com/office/word/2006/wordml" xmlns:wps="http://schemas.microsoft.com/office/word/2010/wordprocessingShape" mc:Ignorable="w14 w15 w16se w16cid w16 w16cex w16sdtdh w16sdtfl w16du wp14">
   <w:p>
     <w:pPr>
       <w:tabs>
@@ -2527,7 +2715,7 @@
 </file>
 
 <file path=word/footnotes.xml><?xml version="1.0" encoding="utf-8"?>
-<w:footnotes xmlns:wpc="http://schemas.microsoft.com/office/word/2010/wordprocessingCanvas" xmlns:cx="http://schemas.microsoft.com/office/drawing/2014/chartex" xmlns:cx1="http://schemas.microsoft.com/office/drawing/2015/9/8/chartex" xmlns:cx2="http://schemas.microsoft.com/office/drawing/2015/10/21/chartex" xmlns:cx3="http://schemas.microsoft.com/office/drawing/2016/5/9/chartex" xmlns:cx4="http://schemas.microsoft.com/office/drawing/2016/5/10/chartex" xmlns:cx5="http://schemas.microsoft.com/office/drawing/2016/5/11/chartex" xmlns:cx6="http://schemas.microsoft.com/office/drawing/2016/5/12/chartex" xmlns:cx7="http://schemas.microsoft.com/office/drawing/2016/5/13/chartex" xmlns:cx8="http://schemas.microsoft.com/office/drawing/2016/5/14/chartex" xmlns:mc="http://schemas.openxmlformats.org/markup-compatibility/2006" xmlns:aink="http://schemas.microsoft.com/office/drawing/2016/ink" xmlns:am3d="http://schemas.microsoft.com/office/drawing/2017/model3d" xmlns:o="urn:schemas-microsoft-com:office:office" xmlns:oel="http://schemas.microsoft.com/office/2019/extlst" xmlns:r="http://schemas.openxmlformats.org/officeDocument/2006/relationships" xmlns:m="http://schemas.openxmlformats.org/officeDocument/2006/math" xmlns:v="urn:schemas-microsoft-com:vml" xmlns:wp14="http://schemas.microsoft.com/office/word/2010/wordprocessingDrawing" xmlns:wp="http://schemas.openxmlformats.org/drawingml/2006/wordprocessingDrawing" xmlns:w10="urn:schemas-microsoft-com:office:word" xmlns:w="http://schemas.openxmlformats.org/wordprocessingml/2006/main" xmlns:w14="http://schemas.microsoft.com/office/word/2010/wordml" xmlns:w15="http://schemas.microsoft.com/office/word/2012/wordml" xmlns:w16cex="http://schemas.microsoft.com/office/word/2018/wordml/cex" xmlns:w16cid="http://schemas.microsoft.com/office/word/2016/wordml/cid" xmlns:w16="http://schemas.microsoft.com/office/word/2018/wordml" xmlns:w16sdtdh="http://schemas.microsoft.com/office/word/2020/wordml/sdtdatahash" xmlns:w16se="http://schemas.microsoft.com/office/word/2015/wordml/symex" xmlns:wpg="http://schemas.microsoft.com/office/word/2010/wordprocessingGroup" xmlns:wpi="http://schemas.microsoft.com/office/word/2010/wordprocessingInk" xmlns:wne="http://schemas.microsoft.com/office/word/2006/wordml" xmlns:wps="http://schemas.microsoft.com/office/word/2010/wordprocessingShape" mc:Ignorable="w14 w15 w16se w16cid w16 w16cex w16sdtdh wp14">
+<w:footnotes xmlns:wpc="http://schemas.microsoft.com/office/word/2010/wordprocessingCanvas" xmlns:cx="http://schemas.microsoft.com/office/drawing/2014/chartex" xmlns:cx1="http://schemas.microsoft.com/office/drawing/2015/9/8/chartex" xmlns:cx2="http://schemas.microsoft.com/office/drawing/2015/10/21/chartex" xmlns:cx3="http://schemas.microsoft.com/office/drawing/2016/5/9/chartex" xmlns:cx4="http://schemas.microsoft.com/office/drawing/2016/5/10/chartex" xmlns:cx5="http://schemas.microsoft.com/office/drawing/2016/5/11/chartex" xmlns:cx6="http://schemas.microsoft.com/office/drawing/2016/5/12/chartex" xmlns:cx7="http://schemas.microsoft.com/office/drawing/2016/5/13/chartex" xmlns:cx8="http://schemas.microsoft.com/office/drawing/2016/5/14/chartex" xmlns:mc="http://schemas.openxmlformats.org/markup-compatibility/2006" xmlns:aink="http://schemas.microsoft.com/office/drawing/2016/ink" xmlns:am3d="http://schemas.microsoft.com/office/drawing/2017/model3d" xmlns:o="urn:schemas-microsoft-com:office:office" xmlns:oel="http://schemas.microsoft.com/office/2019/extlst" xmlns:r="http://schemas.openxmlformats.org/officeDocument/2006/relationships" xmlns:m="http://schemas.openxmlformats.org/officeDocument/2006/math" xmlns:v="urn:schemas-microsoft-com:vml" xmlns:wp14="http://schemas.microsoft.com/office/word/2010/wordprocessingDrawing" xmlns:wp="http://schemas.openxmlformats.org/drawingml/2006/wordprocessingDrawing" xmlns:w10="urn:schemas-microsoft-com:office:word" xmlns:w="http://schemas.openxmlformats.org/wordprocessingml/2006/main" xmlns:w14="http://schemas.microsoft.com/office/word/2010/wordml" xmlns:w15="http://schemas.microsoft.com/office/word/2012/wordml" xmlns:w16cex="http://schemas.microsoft.com/office/word/2018/wordml/cex" xmlns:w16cid="http://schemas.microsoft.com/office/word/2016/wordml/cid" xmlns:w16="http://schemas.microsoft.com/office/word/2018/wordml" xmlns:w16du="http://schemas.microsoft.com/office/word/2023/wordml/word16du" xmlns:w16sdtdh="http://schemas.microsoft.com/office/word/2020/wordml/sdtdatahash" xmlns:w16sdtfl="http://schemas.microsoft.com/office/word/2024/wordml/sdtformatlock" xmlns:w16se="http://schemas.microsoft.com/office/word/2015/wordml/symex" xmlns:wpg="http://schemas.microsoft.com/office/word/2010/wordprocessingGroup" xmlns:wpi="http://schemas.microsoft.com/office/word/2010/wordprocessingInk" xmlns:wne="http://schemas.microsoft.com/office/word/2006/wordml" xmlns:wps="http://schemas.microsoft.com/office/word/2010/wordprocessingShape" mc:Ignorable="w14 w15 w16se w16cid w16 w16cex w16sdtdh w16sdtfl w16du wp14">
   <w:footnote w:type="separator" w:id="-1">
     <w:p>
       <w:pPr>
@@ -2552,7 +2740,7 @@
 </file>
 
 <file path=word/header1.xml><?xml version="1.0" encoding="utf-8"?>
-<w:hdr xmlns:wpc="http://schemas.microsoft.com/office/word/2010/wordprocessingCanvas" xmlns:cx="http://schemas.microsoft.com/office/drawing/2014/chartex" xmlns:cx1="http://schemas.microsoft.com/office/drawing/2015/9/8/chartex" xmlns:cx2="http://schemas.microsoft.com/office/drawing/2015/10/21/chartex" xmlns:cx3="http://schemas.microsoft.com/office/drawing/2016/5/9/chartex" xmlns:cx4="http://schemas.microsoft.com/office/drawing/2016/5/10/chartex" xmlns:cx5="http://schemas.microsoft.com/office/drawing/2016/5/11/chartex" xmlns:cx6="http://schemas.microsoft.com/office/drawing/2016/5/12/chartex" xmlns:cx7="http://schemas.microsoft.com/office/drawing/2016/5/13/chartex" xmlns:cx8="http://schemas.microsoft.com/office/drawing/2016/5/14/chartex" xmlns:mc="http://schemas.openxmlformats.org/markup-compatibility/2006" xmlns:aink="http://schemas.microsoft.com/office/drawing/2016/ink" xmlns:am3d="http://schemas.microsoft.com/office/drawing/2017/model3d" xmlns:o="urn:schemas-microsoft-com:office:office" xmlns:oel="http://schemas.microsoft.com/office/2019/extlst" xmlns:r="http://schemas.openxmlformats.org/officeDocument/2006/relationships" xmlns:m="http://schemas.openxmlformats.org/officeDocument/2006/math" xmlns:v="urn:schemas-microsoft-com:vml" xmlns:wp14="http://schemas.microsoft.com/office/word/2010/wordprocessingDrawing" xmlns:wp="http://schemas.openxmlformats.org/drawingml/2006/wordprocessingDrawing" xmlns:w10="urn:schemas-microsoft-com:office:word" xmlns:w="http://schemas.openxmlformats.org/wordprocessingml/2006/main" xmlns:w14="http://schemas.microsoft.com/office/word/2010/wordml" xmlns:w15="http://schemas.microsoft.com/office/word/2012/wordml" xmlns:w16cex="http://schemas.microsoft.com/office/word/2018/wordml/cex" xmlns:w16cid="http://schemas.microsoft.com/office/word/2016/wordml/cid" xmlns:w16="http://schemas.microsoft.com/office/word/2018/wordml" xmlns:w16sdtdh="http://schemas.microsoft.com/office/word/2020/wordml/sdtdatahash" xmlns:w16se="http://schemas.microsoft.com/office/word/2015/wordml/symex" xmlns:wpg="http://schemas.microsoft.com/office/word/2010/wordprocessingGroup" xmlns:wpi="http://schemas.microsoft.com/office/word/2010/wordprocessingInk" xmlns:wne="http://schemas.microsoft.com/office/word/2006/wordml" xmlns:wps="http://schemas.microsoft.com/office/word/2010/wordprocessingShape" mc:Ignorable="w14 w15 w16se w16cid w16 w16cex w16sdtdh wp14">
+<w:hdr xmlns:wpc="http://schemas.microsoft.com/office/word/2010/wordprocessingCanvas" xmlns:cx="http://schemas.microsoft.com/office/drawing/2014/chartex" xmlns:cx1="http://schemas.microsoft.com/office/drawing/2015/9/8/chartex" xmlns:cx2="http://schemas.microsoft.com/office/drawing/2015/10/21/chartex" xmlns:cx3="http://schemas.microsoft.com/office/drawing/2016/5/9/chartex" xmlns:cx4="http://schemas.microsoft.com/office/drawing/2016/5/10/chartex" xmlns:cx5="http://schemas.microsoft.com/office/drawing/2016/5/11/chartex" xmlns:cx6="http://schemas.microsoft.com/office/drawing/2016/5/12/chartex" xmlns:cx7="http://schemas.microsoft.com/office/drawing/2016/5/13/chartex" xmlns:cx8="http://schemas.microsoft.com/office/drawing/2016/5/14/chartex" xmlns:mc="http://schemas.openxmlformats.org/markup-compatibility/2006" xmlns:aink="http://schemas.microsoft.com/office/drawing/2016/ink" xmlns:am3d="http://schemas.microsoft.com/office/drawing/2017/model3d" xmlns:o="urn:schemas-microsoft-com:office:office" xmlns:oel="http://schemas.microsoft.com/office/2019/extlst" xmlns:r="http://schemas.openxmlformats.org/officeDocument/2006/relationships" xmlns:m="http://schemas.openxmlformats.org/officeDocument/2006/math" xmlns:v="urn:schemas-microsoft-com:vml" xmlns:wp14="http://schemas.microsoft.com/office/word/2010/wordprocessingDrawing" xmlns:wp="http://schemas.openxmlformats.org/drawingml/2006/wordprocessingDrawing" xmlns:w10="urn:schemas-microsoft-com:office:word" xmlns:w="http://schemas.openxmlformats.org/wordprocessingml/2006/main" xmlns:w14="http://schemas.microsoft.com/office/word/2010/wordml" xmlns:w15="http://schemas.microsoft.com/office/word/2012/wordml" xmlns:w16cex="http://schemas.microsoft.com/office/word/2018/wordml/cex" xmlns:w16cid="http://schemas.microsoft.com/office/word/2016/wordml/cid" xmlns:w16="http://schemas.microsoft.com/office/word/2018/wordml" xmlns:w16du="http://schemas.microsoft.com/office/word/2023/wordml/word16du" xmlns:w16sdtdh="http://schemas.microsoft.com/office/word/2020/wordml/sdtdatahash" xmlns:w16sdtfl="http://schemas.microsoft.com/office/word/2024/wordml/sdtformatlock" xmlns:w16se="http://schemas.microsoft.com/office/word/2015/wordml/symex" xmlns:wpg="http://schemas.microsoft.com/office/word/2010/wordprocessingGroup" xmlns:wpi="http://schemas.microsoft.com/office/word/2010/wordprocessingInk" xmlns:wne="http://schemas.microsoft.com/office/word/2006/wordml" xmlns:wps="http://schemas.microsoft.com/office/word/2010/wordprocessingShape" mc:Ignorable="w14 w15 w16se w16cid w16 w16cex w16sdtdh w16sdtfl w16du wp14">
   <w:p>
     <w:pPr>
       <w:tabs>
@@ -2599,7 +2787,7 @@
 </file>
 
 <file path=word/numbering.xml><?xml version="1.0" encoding="utf-8"?>
-<w:numbering xmlns:wpc="http://schemas.microsoft.com/office/word/2010/wordprocessingCanvas" xmlns:cx="http://schemas.microsoft.com/office/drawing/2014/chartex" xmlns:cx1="http://schemas.microsoft.com/office/drawing/2015/9/8/chartex" xmlns:cx2="http://schemas.microsoft.com/office/drawing/2015/10/21/chartex" xmlns:cx3="http://schemas.microsoft.com/office/drawing/2016/5/9/chartex" xmlns:cx4="http://schemas.microsoft.com/office/drawing/2016/5/10/chartex" xmlns:cx5="http://schemas.microsoft.com/office/drawing/2016/5/11/chartex" xmlns:cx6="http://schemas.microsoft.com/office/drawing/2016/5/12/chartex" xmlns:cx7="http://schemas.microsoft.com/office/drawing/2016/5/13/chartex" xmlns:cx8="http://schemas.microsoft.com/office/drawing/2016/5/14/chartex" xmlns:mc="http://schemas.openxmlformats.org/markup-compatibility/2006" xmlns:aink="http://schemas.microsoft.com/office/drawing/2016/ink" xmlns:am3d="http://schemas.microsoft.com/office/drawing/2017/model3d" xmlns:o="urn:schemas-microsoft-com:office:office" xmlns:oel="http://schemas.microsoft.com/office/2019/extlst" xmlns:r="http://schemas.openxmlformats.org/officeDocument/2006/relationships" xmlns:m="http://schemas.openxmlformats.org/officeDocument/2006/math" xmlns:v="urn:schemas-microsoft-com:vml" xmlns:wp14="http://schemas.microsoft.com/office/word/2010/wordprocessingDrawing" xmlns:wp="http://schemas.openxmlformats.org/drawingml/2006/wordprocessingDrawing" xmlns:w10="urn:schemas-microsoft-com:office:word" xmlns:w="http://schemas.openxmlformats.org/wordprocessingml/2006/main" xmlns:w14="http://schemas.microsoft.com/office/word/2010/wordml" xmlns:w15="http://schemas.microsoft.com/office/word/2012/wordml" xmlns:w16cex="http://schemas.microsoft.com/office/word/2018/wordml/cex" xmlns:w16cid="http://schemas.microsoft.com/office/word/2016/wordml/cid" xmlns:w16="http://schemas.microsoft.com/office/word/2018/wordml" xmlns:w16sdtdh="http://schemas.microsoft.com/office/word/2020/wordml/sdtdatahash" xmlns:w16se="http://schemas.microsoft.com/office/word/2015/wordml/symex" xmlns:wpg="http://schemas.microsoft.com/office/word/2010/wordprocessingGroup" xmlns:wpi="http://schemas.microsoft.com/office/word/2010/wordprocessingInk" xmlns:wne="http://schemas.microsoft.com/office/word/2006/wordml" xmlns:wps="http://schemas.microsoft.com/office/word/2010/wordprocessingShape" mc:Ignorable="w14 w15 w16se w16cid w16 w16cex w16sdtdh wp14">
+<w:numbering xmlns:wpc="http://schemas.microsoft.com/office/word/2010/wordprocessingCanvas" xmlns:cx="http://schemas.microsoft.com/office/drawing/2014/chartex" xmlns:cx1="http://schemas.microsoft.com/office/drawing/2015/9/8/chartex" xmlns:cx2="http://schemas.microsoft.com/office/drawing/2015/10/21/chartex" xmlns:cx3="http://schemas.microsoft.com/office/drawing/2016/5/9/chartex" xmlns:cx4="http://schemas.microsoft.com/office/drawing/2016/5/10/chartex" xmlns:cx5="http://schemas.microsoft.com/office/drawing/2016/5/11/chartex" xmlns:cx6="http://schemas.microsoft.com/office/drawing/2016/5/12/chartex" xmlns:cx7="http://schemas.microsoft.com/office/drawing/2016/5/13/chartex" xmlns:cx8="http://schemas.microsoft.com/office/drawing/2016/5/14/chartex" xmlns:mc="http://schemas.openxmlformats.org/markup-compatibility/2006" xmlns:aink="http://schemas.microsoft.com/office/drawing/2016/ink" xmlns:am3d="http://schemas.microsoft.com/office/drawing/2017/model3d" xmlns:o="urn:schemas-microsoft-com:office:office" xmlns:oel="http://schemas.microsoft.com/office/2019/extlst" xmlns:r="http://schemas.openxmlformats.org/officeDocument/2006/relationships" xmlns:m="http://schemas.openxmlformats.org/officeDocument/2006/math" xmlns:v="urn:schemas-microsoft-com:vml" xmlns:wp14="http://schemas.microsoft.com/office/word/2010/wordprocessingDrawing" xmlns:wp="http://schemas.openxmlformats.org/drawingml/2006/wordprocessingDrawing" xmlns:w10="urn:schemas-microsoft-com:office:word" xmlns:w="http://schemas.openxmlformats.org/wordprocessingml/2006/main" xmlns:w14="http://schemas.microsoft.com/office/word/2010/wordml" xmlns:w15="http://schemas.microsoft.com/office/word/2012/wordml" xmlns:w16cex="http://schemas.microsoft.com/office/word/2018/wordml/cex" xmlns:w16cid="http://schemas.microsoft.com/office/word/2016/wordml/cid" xmlns:w16="http://schemas.microsoft.com/office/word/2018/wordml" xmlns:w16du="http://schemas.microsoft.com/office/word/2023/wordml/word16du" xmlns:w16sdtdh="http://schemas.microsoft.com/office/word/2020/wordml/sdtdatahash" xmlns:w16sdtfl="http://schemas.microsoft.com/office/word/2024/wordml/sdtformatlock" xmlns:w16se="http://schemas.microsoft.com/office/word/2015/wordml/symex" xmlns:wpg="http://schemas.microsoft.com/office/word/2010/wordprocessingGroup" xmlns:wpi="http://schemas.microsoft.com/office/word/2010/wordprocessingInk" xmlns:wne="http://schemas.microsoft.com/office/word/2006/wordml" xmlns:wps="http://schemas.microsoft.com/office/word/2010/wordprocessingShape" mc:Ignorable="w14 w15 w16se w16cid w16 w16cex w16sdtdh w16sdtfl w16du wp14">
   <w:abstractNum w:abstractNumId="0" w15:restartNumberingAfterBreak="0">
     <w:nsid w:val="1AC113DD"/>
     <w:multiLevelType w:val="hybridMultilevel"/>
@@ -4892,7 +5080,7 @@
 </file>
 
 <file path=word/styles.xml><?xml version="1.0" encoding="utf-8"?>
-<w:styles xmlns:mc="http://schemas.openxmlformats.org/markup-compatibility/2006" xmlns:r="http://schemas.openxmlformats.org/officeDocument/2006/relationships" xmlns:w="http://schemas.openxmlformats.org/wordprocessingml/2006/main" xmlns:w14="http://schemas.microsoft.com/office/word/2010/wordml" xmlns:w15="http://schemas.microsoft.com/office/word/2012/wordml" xmlns:w16cex="http://schemas.microsoft.com/office/word/2018/wordml/cex" xmlns:w16cid="http://schemas.microsoft.com/office/word/2016/wordml/cid" xmlns:w16="http://schemas.microsoft.com/office/word/2018/wordml" xmlns:w16sdtdh="http://schemas.microsoft.com/office/word/2020/wordml/sdtdatahash" xmlns:w16se="http://schemas.microsoft.com/office/word/2015/wordml/symex" mc:Ignorable="w14 w15 w16se w16cid w16 w16cex w16sdtdh">
+<w:styles xmlns:mc="http://schemas.openxmlformats.org/markup-compatibility/2006" xmlns:r="http://schemas.openxmlformats.org/officeDocument/2006/relationships" xmlns:w="http://schemas.openxmlformats.org/wordprocessingml/2006/main" xmlns:w14="http://schemas.microsoft.com/office/word/2010/wordml" xmlns:w15="http://schemas.microsoft.com/office/word/2012/wordml" xmlns:w16cex="http://schemas.microsoft.com/office/word/2018/wordml/cex" xmlns:w16cid="http://schemas.microsoft.com/office/word/2016/wordml/cid" xmlns:w16="http://schemas.microsoft.com/office/word/2018/wordml" xmlns:w16du="http://schemas.microsoft.com/office/word/2023/wordml/word16du" xmlns:w16sdtdh="http://schemas.microsoft.com/office/word/2020/wordml/sdtdatahash" xmlns:w16sdtfl="http://schemas.microsoft.com/office/word/2024/wordml/sdtformatlock" xmlns:w16se="http://schemas.microsoft.com/office/word/2015/wordml/symex" mc:Ignorable="w14 w15 w16se w16cid w16 w16cex w16sdtdh w16sdtfl w16du">
   <w:docDefaults>
     <w:rPrDefault>
       <w:rPr>
@@ -5316,6 +5504,7 @@
   <w:style w:type="character" w:default="1" w:styleId="Carpredefinitoparagrafo">
     <w:name w:val="Default Paragraph Font"/>
     <w:uiPriority w:val="1"/>
+    <w:semiHidden/>
     <w:unhideWhenUsed/>
   </w:style>
   <w:style w:type="table" w:default="1" w:styleId="Tabellanormale">
@@ -5771,7 +5960,7 @@
 </file>
 
 <file path=word/glossary/document.xml><?xml version="1.0" encoding="utf-8"?>
-<w:glossaryDocument xmlns:wpc="http://schemas.microsoft.com/office/word/2010/wordprocessingCanvas" xmlns:cx="http://schemas.microsoft.com/office/drawing/2014/chartex" xmlns:cx1="http://schemas.microsoft.com/office/drawing/2015/9/8/chartex" xmlns:cx2="http://schemas.microsoft.com/office/drawing/2015/10/21/chartex" xmlns:cx3="http://schemas.microsoft.com/office/drawing/2016/5/9/chartex" xmlns:cx4="http://schemas.microsoft.com/office/drawing/2016/5/10/chartex" xmlns:cx5="http://schemas.microsoft.com/office/drawing/2016/5/11/chartex" xmlns:cx6="http://schemas.microsoft.com/office/drawing/2016/5/12/chartex" xmlns:cx7="http://schemas.microsoft.com/office/drawing/2016/5/13/chartex" xmlns:cx8="http://schemas.microsoft.com/office/drawing/2016/5/14/chartex" xmlns:mc="http://schemas.openxmlformats.org/markup-compatibility/2006" xmlns:aink="http://schemas.microsoft.com/office/drawing/2016/ink" xmlns:am3d="http://schemas.microsoft.com/office/drawing/2017/model3d" xmlns:o="urn:schemas-microsoft-com:office:office" xmlns:oel="http://schemas.microsoft.com/office/2019/extlst" xmlns:r="http://schemas.openxmlformats.org/officeDocument/2006/relationships" xmlns:m="http://schemas.openxmlformats.org/officeDocument/2006/math" xmlns:v="urn:schemas-microsoft-com:vml" xmlns:wp14="http://schemas.microsoft.com/office/word/2010/wordprocessingDrawing" xmlns:wp="http://schemas.openxmlformats.org/drawingml/2006/wordprocessingDrawing" xmlns:w10="urn:schemas-microsoft-com:office:word" xmlns:w="http://schemas.openxmlformats.org/wordprocessingml/2006/main" xmlns:w14="http://schemas.microsoft.com/office/word/2010/wordml" xmlns:w15="http://schemas.microsoft.com/office/word/2012/wordml" xmlns:w16cex="http://schemas.microsoft.com/office/word/2018/wordml/cex" xmlns:w16cid="http://schemas.microsoft.com/office/word/2016/wordml/cid" xmlns:w16="http://schemas.microsoft.com/office/word/2018/wordml" xmlns:w16sdtdh="http://schemas.microsoft.com/office/word/2020/wordml/sdtdatahash" xmlns:w16se="http://schemas.microsoft.com/office/word/2015/wordml/symex" xmlns:wpg="http://schemas.microsoft.com/office/word/2010/wordprocessingGroup" xmlns:wpi="http://schemas.microsoft.com/office/word/2010/wordprocessingInk" xmlns:wne="http://schemas.microsoft.com/office/word/2006/wordml" xmlns:wps="http://schemas.microsoft.com/office/word/2010/wordprocessingShape" mc:Ignorable="w14 w15 w16se w16cid w16 w16cex w16sdtdh wp14">
+<w:glossaryDocument xmlns:wpc="http://schemas.microsoft.com/office/word/2010/wordprocessingCanvas" xmlns:cx="http://schemas.microsoft.com/office/drawing/2014/chartex" xmlns:cx1="http://schemas.microsoft.com/office/drawing/2015/9/8/chartex" xmlns:cx2="http://schemas.microsoft.com/office/drawing/2015/10/21/chartex" xmlns:cx3="http://schemas.microsoft.com/office/drawing/2016/5/9/chartex" xmlns:cx4="http://schemas.microsoft.com/office/drawing/2016/5/10/chartex" xmlns:cx5="http://schemas.microsoft.com/office/drawing/2016/5/11/chartex" xmlns:cx6="http://schemas.microsoft.com/office/drawing/2016/5/12/chartex" xmlns:cx7="http://schemas.microsoft.com/office/drawing/2016/5/13/chartex" xmlns:cx8="http://schemas.microsoft.com/office/drawing/2016/5/14/chartex" xmlns:mc="http://schemas.openxmlformats.org/markup-compatibility/2006" xmlns:aink="http://schemas.microsoft.com/office/drawing/2016/ink" xmlns:am3d="http://schemas.microsoft.com/office/drawing/2017/model3d" xmlns:o="urn:schemas-microsoft-com:office:office" xmlns:oel="http://schemas.microsoft.com/office/2019/extlst" xmlns:r="http://schemas.openxmlformats.org/officeDocument/2006/relationships" xmlns:m="http://schemas.openxmlformats.org/officeDocument/2006/math" xmlns:v="urn:schemas-microsoft-com:vml" xmlns:wp14="http://schemas.microsoft.com/office/word/2010/wordprocessingDrawing" xmlns:wp="http://schemas.openxmlformats.org/drawingml/2006/wordprocessingDrawing" xmlns:w10="urn:schemas-microsoft-com:office:word" xmlns:w="http://schemas.openxmlformats.org/wordprocessingml/2006/main" xmlns:w14="http://schemas.microsoft.com/office/word/2010/wordml" xmlns:w15="http://schemas.microsoft.com/office/word/2012/wordml" xmlns:w16cex="http://schemas.microsoft.com/office/word/2018/wordml/cex" xmlns:w16cid="http://schemas.microsoft.com/office/word/2016/wordml/cid" xmlns:w16="http://schemas.microsoft.com/office/word/2018/wordml" xmlns:w16du="http://schemas.microsoft.com/office/word/2023/wordml/word16du" xmlns:w16sdtdh="http://schemas.microsoft.com/office/word/2020/wordml/sdtdatahash" xmlns:w16sdtfl="http://schemas.microsoft.com/office/word/2024/wordml/sdtformatlock" xmlns:w16se="http://schemas.microsoft.com/office/word/2015/wordml/symex" xmlns:wpg="http://schemas.microsoft.com/office/word/2010/wordprocessingGroup" xmlns:wpi="http://schemas.microsoft.com/office/word/2010/wordprocessingInk" xmlns:wne="http://schemas.microsoft.com/office/word/2006/wordml" xmlns:wps="http://schemas.microsoft.com/office/word/2010/wordprocessingShape" mc:Ignorable="w14 w15 w16se w16cid w16 w16cex w16sdtdh w16sdtfl w16du wp14">
   <w:docParts>
     <w:docPart>
       <w:docPartPr>
@@ -5807,7 +5996,7 @@
 </file>
 
 <file path=word/glossary/fontTable.xml><?xml version="1.0" encoding="utf-8"?>
-<w:fonts xmlns:mc="http://schemas.openxmlformats.org/markup-compatibility/2006" xmlns:r="http://schemas.openxmlformats.org/officeDocument/2006/relationships" xmlns:w="http://schemas.openxmlformats.org/wordprocessingml/2006/main" xmlns:w14="http://schemas.microsoft.com/office/word/2010/wordml" xmlns:w15="http://schemas.microsoft.com/office/word/2012/wordml" xmlns:w16cex="http://schemas.microsoft.com/office/word/2018/wordml/cex" xmlns:w16cid="http://schemas.microsoft.com/office/word/2016/wordml/cid" xmlns:w16="http://schemas.microsoft.com/office/word/2018/wordml" xmlns:w16sdtdh="http://schemas.microsoft.com/office/word/2020/wordml/sdtdatahash" xmlns:w16se="http://schemas.microsoft.com/office/word/2015/wordml/symex" mc:Ignorable="w14 w15 w16se w16cid w16 w16cex w16sdtdh">
+<w:fonts xmlns:mc="http://schemas.openxmlformats.org/markup-compatibility/2006" xmlns:r="http://schemas.openxmlformats.org/officeDocument/2006/relationships" xmlns:w="http://schemas.openxmlformats.org/wordprocessingml/2006/main" xmlns:w14="http://schemas.microsoft.com/office/word/2010/wordml" xmlns:w15="http://schemas.microsoft.com/office/word/2012/wordml" xmlns:w16cex="http://schemas.microsoft.com/office/word/2018/wordml/cex" xmlns:w16cid="http://schemas.microsoft.com/office/word/2016/wordml/cid" xmlns:w16="http://schemas.microsoft.com/office/word/2018/wordml" xmlns:w16du="http://schemas.microsoft.com/office/word/2023/wordml/word16du" xmlns:w16sdtdh="http://schemas.microsoft.com/office/word/2020/wordml/sdtdatahash" xmlns:w16sdtfl="http://schemas.microsoft.com/office/word/2024/wordml/sdtformatlock" xmlns:w16se="http://schemas.microsoft.com/office/word/2015/wordml/symex" mc:Ignorable="w14 w15 w16se w16cid w16 w16cex w16sdtdh w16sdtfl w16du">
   <w:font w:name="Calibri">
     <w:panose1 w:val="020F0502020204030204"/>
     <w:charset w:val="00"/>
@@ -5880,7 +6069,7 @@
 </file>
 
 <file path=word/glossary/settings.xml><?xml version="1.0" encoding="utf-8"?>
-<w:settings xmlns:mc="http://schemas.openxmlformats.org/markup-compatibility/2006" xmlns:o="urn:schemas-microsoft-com:office:office" xmlns:r="http://schemas.openxmlformats.org/officeDocument/2006/relationships" xmlns:m="http://schemas.openxmlformats.org/officeDocument/2006/math" xmlns:v="urn:schemas-microsoft-com:vml" xmlns:w10="urn:schemas-microsoft-com:office:word" xmlns:w="http://schemas.openxmlformats.org/wordprocessingml/2006/main" xmlns:w14="http://schemas.microsoft.com/office/word/2010/wordml" xmlns:w15="http://schemas.microsoft.com/office/word/2012/wordml" xmlns:w16cex="http://schemas.microsoft.com/office/word/2018/wordml/cex" xmlns:w16cid="http://schemas.microsoft.com/office/word/2016/wordml/cid" xmlns:w16="http://schemas.microsoft.com/office/word/2018/wordml" xmlns:w16sdtdh="http://schemas.microsoft.com/office/word/2020/wordml/sdtdatahash" xmlns:w16se="http://schemas.microsoft.com/office/word/2015/wordml/symex" xmlns:sl="http://schemas.openxmlformats.org/schemaLibrary/2006/main" mc:Ignorable="w14 w15 w16se w16cid w16 w16cex w16sdtdh">
+<w:settings xmlns:mc="http://schemas.openxmlformats.org/markup-compatibility/2006" xmlns:o="urn:schemas-microsoft-com:office:office" xmlns:r="http://schemas.openxmlformats.org/officeDocument/2006/relationships" xmlns:m="http://schemas.openxmlformats.org/officeDocument/2006/math" xmlns:v="urn:schemas-microsoft-com:vml" xmlns:w10="urn:schemas-microsoft-com:office:word" xmlns:w="http://schemas.openxmlformats.org/wordprocessingml/2006/main" xmlns:w14="http://schemas.microsoft.com/office/word/2010/wordml" xmlns:w15="http://schemas.microsoft.com/office/word/2012/wordml" xmlns:w16cex="http://schemas.microsoft.com/office/word/2018/wordml/cex" xmlns:w16cid="http://schemas.microsoft.com/office/word/2016/wordml/cid" xmlns:w16="http://schemas.microsoft.com/office/word/2018/wordml" xmlns:w16du="http://schemas.microsoft.com/office/word/2023/wordml/word16du" xmlns:w16sdtdh="http://schemas.microsoft.com/office/word/2020/wordml/sdtdatahash" xmlns:w16sdtfl="http://schemas.microsoft.com/office/word/2024/wordml/sdtformatlock" xmlns:w16se="http://schemas.microsoft.com/office/word/2015/wordml/symex" xmlns:sl="http://schemas.openxmlformats.org/schemaLibrary/2006/main" mc:Ignorable="w14 w15 w16se w16cid w16 w16cex w16sdtdh w16sdtfl w16du">
   <w:view w:val="normal"/>
   <w:defaultTabStop w:val="708"/>
   <w:hyphenationZone w:val="283"/>
@@ -5927,6 +6116,7 @@
     <w:rsid w:val="00357BE2"/>
     <w:rsid w:val="00390B51"/>
     <w:rsid w:val="00392F29"/>
+    <w:rsid w:val="003A4DA9"/>
     <w:rsid w:val="003B33FF"/>
     <w:rsid w:val="003B7632"/>
     <w:rsid w:val="003F5C32"/>
@@ -5987,6 +6177,7 @@
     <w:rsid w:val="0095694A"/>
     <w:rsid w:val="00997E7D"/>
     <w:rsid w:val="009D5B0A"/>
+    <w:rsid w:val="009F50F2"/>
     <w:rsid w:val="00A139A6"/>
     <w:rsid w:val="00A1514F"/>
     <w:rsid w:val="00A352DF"/>
@@ -6064,7 +6255,7 @@
 </file>
 
 <file path=word/glossary/styles.xml><?xml version="1.0" encoding="utf-8"?>
-<w:styles xmlns:mc="http://schemas.openxmlformats.org/markup-compatibility/2006" xmlns:r="http://schemas.openxmlformats.org/officeDocument/2006/relationships" xmlns:w="http://schemas.openxmlformats.org/wordprocessingml/2006/main" xmlns:w14="http://schemas.microsoft.com/office/word/2010/wordml" xmlns:w15="http://schemas.microsoft.com/office/word/2012/wordml" xmlns:w16cex="http://schemas.microsoft.com/office/word/2018/wordml/cex" xmlns:w16cid="http://schemas.microsoft.com/office/word/2016/wordml/cid" xmlns:w16="http://schemas.microsoft.com/office/word/2018/wordml" xmlns:w16sdtdh="http://schemas.microsoft.com/office/word/2020/wordml/sdtdatahash" xmlns:w16se="http://schemas.microsoft.com/office/word/2015/wordml/symex" mc:Ignorable="w14 w15 w16se w16cid w16 w16cex w16sdtdh">
+<w:styles xmlns:mc="http://schemas.openxmlformats.org/markup-compatibility/2006" xmlns:r="http://schemas.openxmlformats.org/officeDocument/2006/relationships" xmlns:w="http://schemas.openxmlformats.org/wordprocessingml/2006/main" xmlns:w14="http://schemas.microsoft.com/office/word/2010/wordml" xmlns:w15="http://schemas.microsoft.com/office/word/2012/wordml" xmlns:w16cex="http://schemas.microsoft.com/office/word/2018/wordml/cex" xmlns:w16cid="http://schemas.microsoft.com/office/word/2016/wordml/cid" xmlns:w16="http://schemas.microsoft.com/office/word/2018/wordml" xmlns:w16du="http://schemas.microsoft.com/office/word/2023/wordml/word16du" xmlns:w16sdtdh="http://schemas.microsoft.com/office/word/2020/wordml/sdtdatahash" xmlns:w16sdtfl="http://schemas.microsoft.com/office/word/2024/wordml/sdtformatlock" xmlns:w16se="http://schemas.microsoft.com/office/word/2015/wordml/symex" mc:Ignorable="w14 w15 w16se w16cid w16 w16cex w16sdtdh w16sdtfl w16du">
   <w:docDefaults>
     <w:rPrDefault>
       <w:rPr>
@@ -6500,7 +6691,7 @@
 </file>
 
 <file path=word/glossary/webSettings.xml><?xml version="1.0" encoding="utf-8"?>
-<w:webSettings xmlns:mc="http://schemas.openxmlformats.org/markup-compatibility/2006" xmlns:r="http://schemas.openxmlformats.org/officeDocument/2006/relationships" xmlns:w="http://schemas.openxmlformats.org/wordprocessingml/2006/main" xmlns:w14="http://schemas.microsoft.com/office/word/2010/wordml" xmlns:w15="http://schemas.microsoft.com/office/word/2012/wordml" xmlns:w16cex="http://schemas.microsoft.com/office/word/2018/wordml/cex" xmlns:w16cid="http://schemas.microsoft.com/office/word/2016/wordml/cid" xmlns:w16="http://schemas.microsoft.com/office/word/2018/wordml" xmlns:w16sdtdh="http://schemas.microsoft.com/office/word/2020/wordml/sdtdatahash" xmlns:w16se="http://schemas.microsoft.com/office/word/2015/wordml/symex" mc:Ignorable="w14 w15 w16se w16cid w16 w16cex w16sdtdh">
+<w:webSettings xmlns:mc="http://schemas.openxmlformats.org/markup-compatibility/2006" xmlns:r="http://schemas.openxmlformats.org/officeDocument/2006/relationships" xmlns:w="http://schemas.openxmlformats.org/wordprocessingml/2006/main" xmlns:w14="http://schemas.microsoft.com/office/word/2010/wordml" xmlns:w15="http://schemas.microsoft.com/office/word/2012/wordml" xmlns:w16cex="http://schemas.microsoft.com/office/word/2018/wordml/cex" xmlns:w16cid="http://schemas.microsoft.com/office/word/2016/wordml/cid" xmlns:w16="http://schemas.microsoft.com/office/word/2018/wordml" xmlns:w16du="http://schemas.microsoft.com/office/word/2023/wordml/word16du" xmlns:w16sdtdh="http://schemas.microsoft.com/office/word/2020/wordml/sdtdatahash" xmlns:w16sdtfl="http://schemas.microsoft.com/office/word/2024/wordml/sdtformatlock" xmlns:w16se="http://schemas.microsoft.com/office/word/2015/wordml/symex" mc:Ignorable="w14 w15 w16se w16cid w16 w16cex w16sdtdh w16sdtfl w16du">
   <w:optimizeForBrowser/>
   <w:allowPNG/>
 </w:webSettings>

</xml_diff>